<commit_message>
feat: atualiza template de contrato com modelo Lago Di Gravatá
Substitui o template anterior pelo modelo atualizado com cláusulas revisadas:
- Bônus por performance: agora 60% VSO em 30 dias (antes 50% em 90 dias)
- Não aliciamento: prazo de 24 meses (explicitado)
- Foro: Palhoça/SC (fixo)
- Todas as variáveis docxtemplater mantidas: {RAZAO_SOCIAL}, {CNPJ},
  {ENDERECO_CLIENTE}, {EMAIL}, {TELEFONE}, {NOME_EMPREENDIMENTO},
  {ENDERECO_EMPREENDIMENTO}, {NUM_UNIDADES}, {VGV_ESTIMADO},
  {PERCENTUAL_R2X}, {PERCENTUAL_EXTENSO}, {NOME_REPRESENTANTE},
  {CIDADE_ASSINATURA}

Co-Authored-By: Claude Sonnet 4.6 <noreply@anthropic.com>
</commit_message>
<xml_diff>
--- a/templates/contrato-template.docx
+++ b/templates/contrato-template.docx
@@ -7,12 +7,12 @@
         <w:spacing w:after="40"/>
         <w:jc w:val="center"/>
         <w:rPr>
-          <w:rFonts w:ascii="Segoe UI" w:hAnsi="Segoe UI" w:cs="Segoe UI"/>
-        </w:rPr>
-      </w:pPr>
-      <w:r>
-        <w:rPr>
-          <w:rFonts w:ascii="Segoe UI" w:eastAsia="Arial" w:hAnsi="Segoe UI" w:cs="Segoe UI"/>
+          <w:rFonts w:asciiTheme="minorHAnsi" w:hAnsiTheme="minorHAnsi" w:cs="Segoe UI"/>
+        </w:rPr>
+      </w:pPr>
+      <w:r>
+        <w:rPr>
+          <w:rFonts w:asciiTheme="minorHAnsi" w:eastAsia="Arial" w:hAnsiTheme="minorHAnsi" w:cs="Segoe UI"/>
           <w:b/>
           <w:bCs/>
           <w:color w:val="2B4D6E"/>
@@ -27,12 +27,12 @@
         <w:spacing w:after="240"/>
         <w:jc w:val="center"/>
         <w:rPr>
-          <w:rFonts w:ascii="Segoe UI" w:hAnsi="Segoe UI" w:cs="Segoe UI"/>
-        </w:rPr>
-      </w:pPr>
-      <w:r>
-        <w:rPr>
-          <w:rFonts w:ascii="Segoe UI" w:eastAsia="Arial" w:hAnsi="Segoe UI" w:cs="Segoe UI"/>
+          <w:rFonts w:asciiTheme="minorHAnsi" w:hAnsiTheme="minorHAnsi" w:cs="Segoe UI"/>
+        </w:rPr>
+      </w:pPr>
+      <w:r>
+        <w:rPr>
+          <w:rFonts w:asciiTheme="minorHAnsi" w:eastAsia="Arial" w:hAnsiTheme="minorHAnsi" w:cs="Segoe UI"/>
           <w:b/>
           <w:bCs/>
           <w:color w:val="555555"/>
@@ -47,7 +47,7 @@
         </w:pBdr>
         <w:spacing w:before="120" w:after="240"/>
         <w:rPr>
-          <w:rFonts w:ascii="Segoe UI" w:hAnsi="Segoe UI" w:cs="Segoe UI"/>
+          <w:rFonts w:asciiTheme="minorHAnsi" w:hAnsiTheme="minorHAnsi" w:cs="Segoe UI"/>
         </w:rPr>
       </w:pPr>
     </w:p>
@@ -58,12 +58,12 @@
         </w:pBdr>
         <w:spacing w:before="300" w:after="120"/>
         <w:rPr>
-          <w:rFonts w:ascii="Segoe UI" w:hAnsi="Segoe UI" w:cs="Segoe UI"/>
-        </w:rPr>
-      </w:pPr>
-      <w:r>
-        <w:rPr>
-          <w:rFonts w:ascii="Segoe UI" w:eastAsia="Arial" w:hAnsi="Segoe UI" w:cs="Segoe UI"/>
+          <w:rFonts w:asciiTheme="minorHAnsi" w:hAnsiTheme="minorHAnsi" w:cs="Segoe UI"/>
+        </w:rPr>
+      </w:pPr>
+      <w:r>
+        <w:rPr>
+          <w:rFonts w:asciiTheme="minorHAnsi" w:eastAsia="Arial" w:hAnsiTheme="minorHAnsi" w:cs="Segoe UI"/>
           <w:b/>
           <w:bCs/>
           <w:color w:val="2B4D6E"/>
@@ -77,7 +77,7 @@
       <w:pPr>
         <w:spacing w:before="160"/>
         <w:rPr>
-          <w:rFonts w:ascii="Segoe UI" w:hAnsi="Segoe UI" w:cs="Segoe UI"/>
+          <w:rFonts w:asciiTheme="minorHAnsi" w:hAnsiTheme="minorHAnsi" w:cs="Segoe UI"/>
         </w:rPr>
       </w:pPr>
     </w:p>
@@ -103,12 +103,6 @@
         <w:gridCol w:w="4680"/>
       </w:tblGrid>
       <w:tr>
-        <w:tblPrEx>
-          <w:tblCellMar>
-            <w:top w:w="0" w:type="dxa"/>
-            <w:bottom w:w="0" w:type="dxa"/>
-          </w:tblCellMar>
-        </w:tblPrEx>
         <w:tc>
           <w:tcPr>
             <w:tcW w:w="4500" w:type="dxa"/>
@@ -131,12 +125,12 @@
               <w:spacing w:before="80" w:after="80"/>
               <w:jc w:val="both"/>
               <w:rPr>
-                <w:rFonts w:ascii="Segoe UI" w:hAnsi="Segoe UI" w:cs="Segoe UI"/>
+                <w:rFonts w:asciiTheme="minorHAnsi" w:hAnsiTheme="minorHAnsi" w:cs="Segoe UI"/>
               </w:rPr>
             </w:pPr>
             <w:r>
               <w:rPr>
-                <w:rFonts w:ascii="Segoe UI" w:eastAsia="Arial" w:hAnsi="Segoe UI" w:cs="Segoe UI"/>
+                <w:rFonts w:asciiTheme="minorHAnsi" w:eastAsia="Arial" w:hAnsiTheme="minorHAnsi" w:cs="Segoe UI"/>
                 <w:b/>
                 <w:bCs/>
                 <w:color w:val="2B4D6E"/>
@@ -149,12 +143,12 @@
               <w:spacing w:before="80" w:after="80"/>
               <w:jc w:val="both"/>
               <w:rPr>
-                <w:rFonts w:ascii="Segoe UI" w:hAnsi="Segoe UI" w:cs="Segoe UI"/>
+                <w:rFonts w:asciiTheme="minorHAnsi" w:hAnsiTheme="minorHAnsi" w:cs="Segoe UI"/>
               </w:rPr>
             </w:pPr>
             <w:r>
               <w:rPr>
-                <w:rFonts w:ascii="Segoe UI" w:eastAsia="Arial" w:hAnsi="Segoe UI" w:cs="Segoe UI"/>
+                <w:rFonts w:asciiTheme="minorHAnsi" w:eastAsia="Arial" w:hAnsiTheme="minorHAnsi" w:cs="Segoe UI"/>
                 <w:b/>
                 <w:bCs/>
                 <w:color w:val="1A1A1A"/>
@@ -167,12 +161,12 @@
               <w:spacing w:before="80" w:after="80"/>
               <w:jc w:val="both"/>
               <w:rPr>
-                <w:rFonts w:ascii="Segoe UI" w:hAnsi="Segoe UI" w:cs="Segoe UI"/>
+                <w:rFonts w:asciiTheme="minorHAnsi" w:hAnsiTheme="minorHAnsi" w:cs="Segoe UI"/>
               </w:rPr>
             </w:pPr>
             <w:r>
               <w:rPr>
-                <w:rFonts w:ascii="Segoe UI" w:eastAsia="Arial" w:hAnsi="Segoe UI" w:cs="Segoe UI"/>
+                <w:rFonts w:asciiTheme="minorHAnsi" w:eastAsia="Arial" w:hAnsiTheme="minorHAnsi" w:cs="Segoe UI"/>
                 <w:color w:val="1A1A1A"/>
               </w:rPr>
               <w:t>CNPJ: 60.313.322/0001-12</w:t>
@@ -183,31 +177,15 @@
               <w:spacing w:before="80" w:after="80"/>
               <w:jc w:val="both"/>
               <w:rPr>
-                <w:rFonts w:ascii="Segoe UI" w:hAnsi="Segoe UI" w:cs="Segoe UI"/>
+                <w:rFonts w:asciiTheme="minorHAnsi" w:hAnsiTheme="minorHAnsi" w:cs="Segoe UI"/>
               </w:rPr>
             </w:pPr>
             <w:r>
               <w:rPr>
-                <w:rFonts w:ascii="Segoe UI" w:eastAsia="Arial" w:hAnsi="Segoe UI" w:cs="Segoe UI"/>
+                <w:rFonts w:asciiTheme="minorHAnsi" w:eastAsia="Arial" w:hAnsiTheme="minorHAnsi" w:cs="Segoe UI"/>
                 <w:color w:val="1A1A1A"/>
               </w:rPr>
-              <w:t xml:space="preserve">Rua Wilson </w:t>
-            </w:r>
-            <w:proofErr w:type="spellStart"/>
-            <w:r>
-              <w:rPr>
-                <w:rFonts w:ascii="Segoe UI" w:eastAsia="Arial" w:hAnsi="Segoe UI" w:cs="Segoe UI"/>
-                <w:color w:val="1A1A1A"/>
-              </w:rPr>
-              <w:t>Westphal</w:t>
-            </w:r>
-            <w:proofErr w:type="spellEnd"/>
-            <w:r>
-              <w:rPr>
-                <w:rFonts w:ascii="Segoe UI" w:eastAsia="Arial" w:hAnsi="Segoe UI" w:cs="Segoe UI"/>
-                <w:color w:val="1A1A1A"/>
-              </w:rPr>
-              <w:t>, nº 83, Centro</w:t>
+              <w:t>Rua Wilson Westphal, nº 83, Centro</w:t>
             </w:r>
           </w:p>
           <w:p>
@@ -215,12 +193,12 @@
               <w:spacing w:before="80" w:after="80"/>
               <w:jc w:val="both"/>
               <w:rPr>
-                <w:rFonts w:ascii="Segoe UI" w:hAnsi="Segoe UI" w:cs="Segoe UI"/>
+                <w:rFonts w:asciiTheme="minorHAnsi" w:hAnsiTheme="minorHAnsi" w:cs="Segoe UI"/>
               </w:rPr>
             </w:pPr>
             <w:r>
               <w:rPr>
-                <w:rFonts w:ascii="Segoe UI" w:eastAsia="Arial" w:hAnsi="Segoe UI" w:cs="Segoe UI"/>
+                <w:rFonts w:asciiTheme="minorHAnsi" w:eastAsia="Arial" w:hAnsiTheme="minorHAnsi" w:cs="Segoe UI"/>
                 <w:color w:val="1A1A1A"/>
               </w:rPr>
               <w:t>Braço do Norte/SC — CEP 88.750-000</w:t>
@@ -231,12 +209,12 @@
               <w:spacing w:before="80" w:after="80"/>
               <w:jc w:val="both"/>
               <w:rPr>
-                <w:rFonts w:ascii="Segoe UI" w:hAnsi="Segoe UI" w:cs="Segoe UI"/>
+                <w:rFonts w:asciiTheme="minorHAnsi" w:hAnsiTheme="minorHAnsi" w:cs="Segoe UI"/>
               </w:rPr>
             </w:pPr>
             <w:r>
               <w:rPr>
-                <w:rFonts w:ascii="Segoe UI" w:eastAsia="Arial" w:hAnsi="Segoe UI" w:cs="Segoe UI"/>
+                <w:rFonts w:asciiTheme="minorHAnsi" w:eastAsia="Arial" w:hAnsiTheme="minorHAnsi" w:cs="Segoe UI"/>
                 <w:color w:val="1A1A1A"/>
               </w:rPr>
               <w:t>r2x.comercial@gmail.com</w:t>
@@ -247,12 +225,12 @@
               <w:spacing w:before="80" w:after="80"/>
               <w:jc w:val="both"/>
               <w:rPr>
-                <w:rFonts w:ascii="Segoe UI" w:hAnsi="Segoe UI" w:cs="Segoe UI"/>
+                <w:rFonts w:asciiTheme="minorHAnsi" w:hAnsiTheme="minorHAnsi" w:cs="Segoe UI"/>
               </w:rPr>
             </w:pPr>
             <w:r>
               <w:rPr>
-                <w:rFonts w:ascii="Segoe UI" w:eastAsia="Arial" w:hAnsi="Segoe UI" w:cs="Segoe UI"/>
+                <w:rFonts w:asciiTheme="minorHAnsi" w:eastAsia="Arial" w:hAnsiTheme="minorHAnsi" w:cs="Segoe UI"/>
                 <w:color w:val="1A1A1A"/>
               </w:rPr>
               <w:t>(48) 98821-0544</w:t>
@@ -281,12 +259,12 @@
               <w:spacing w:before="80" w:after="80"/>
               <w:jc w:val="both"/>
               <w:rPr>
-                <w:rFonts w:ascii="Segoe UI" w:hAnsi="Segoe UI" w:cs="Segoe UI"/>
+                <w:rFonts w:asciiTheme="minorHAnsi" w:hAnsiTheme="minorHAnsi" w:cs="Segoe UI"/>
               </w:rPr>
             </w:pPr>
             <w:r>
               <w:rPr>
-                <w:rFonts w:ascii="Segoe UI" w:eastAsia="Arial" w:hAnsi="Segoe UI" w:cs="Segoe UI"/>
+                <w:rFonts w:asciiTheme="minorHAnsi" w:eastAsia="Arial" w:hAnsiTheme="minorHAnsi" w:cs="Segoe UI"/>
                 <w:b/>
                 <w:bCs/>
                 <w:color w:val="2B4D6E"/>
@@ -299,12 +277,12 @@
               <w:spacing w:before="80" w:after="80"/>
               <w:jc w:val="both"/>
               <w:rPr>
-                <w:rFonts w:ascii="Segoe UI" w:hAnsi="Segoe UI" w:cs="Segoe UI"/>
+                <w:rFonts w:asciiTheme="minorHAnsi" w:hAnsiTheme="minorHAnsi" w:cs="Segoe UI"/>
               </w:rPr>
             </w:pPr>
             <w:r>
               <w:rPr>
-                <w:rFonts w:ascii="Segoe UI" w:eastAsia="Arial" w:hAnsi="Segoe UI" w:cs="Segoe UI"/>
+                <w:rFonts w:asciiTheme="minorHAnsi" w:eastAsia="Arial" w:hAnsiTheme="minorHAnsi" w:cs="Segoe UI"/>
                 <w:b/>
                 <w:bCs/>
                 <w:color w:val="1A1A1A"/>
@@ -317,12 +295,12 @@
               <w:spacing w:before="80" w:after="80"/>
               <w:jc w:val="both"/>
               <w:rPr>
-                <w:rFonts w:ascii="Segoe UI" w:hAnsi="Segoe UI" w:cs="Segoe UI"/>
+                <w:rFonts w:asciiTheme="minorHAnsi" w:hAnsiTheme="minorHAnsi" w:cs="Segoe UI"/>
               </w:rPr>
             </w:pPr>
             <w:r>
               <w:rPr>
-                <w:rFonts w:ascii="Segoe UI" w:eastAsia="Arial" w:hAnsi="Segoe UI" w:cs="Segoe UI"/>
+                <w:rFonts w:asciiTheme="minorHAnsi" w:eastAsia="Arial" w:hAnsiTheme="minorHAnsi" w:cs="Segoe UI"/>
                 <w:color w:val="1A1A1A"/>
               </w:rPr>
               <w:t>CNPJ: {CNPJ}</w:t>
@@ -333,12 +311,12 @@
               <w:spacing w:before="80" w:after="80"/>
               <w:jc w:val="both"/>
               <w:rPr>
-                <w:rFonts w:ascii="Segoe UI" w:hAnsi="Segoe UI" w:cs="Segoe UI"/>
+                <w:rFonts w:asciiTheme="minorHAnsi" w:hAnsiTheme="minorHAnsi" w:cs="Segoe UI"/>
               </w:rPr>
             </w:pPr>
             <w:r>
               <w:rPr>
-                <w:rFonts w:ascii="Segoe UI" w:eastAsia="Arial" w:hAnsi="Segoe UI" w:cs="Segoe UI"/>
+                <w:rFonts w:asciiTheme="minorHAnsi" w:eastAsia="Arial" w:hAnsiTheme="minorHAnsi" w:cs="Segoe UI"/>
                 <w:color w:val="1A1A1A"/>
               </w:rPr>
               <w:t>{ENDERECO_CLIENTE}</w:t>
@@ -349,12 +327,12 @@
               <w:spacing w:before="80" w:after="80"/>
               <w:jc w:val="both"/>
               <w:rPr>
-                <w:rFonts w:ascii="Segoe UI" w:hAnsi="Segoe UI" w:cs="Segoe UI"/>
+                <w:rFonts w:asciiTheme="minorHAnsi" w:hAnsiTheme="minorHAnsi" w:cs="Segoe UI"/>
               </w:rPr>
             </w:pPr>
             <w:r>
               <w:rPr>
-                <w:rFonts w:ascii="Segoe UI" w:eastAsia="Arial" w:hAnsi="Segoe UI" w:cs="Segoe UI"/>
+                <w:rFonts w:asciiTheme="minorHAnsi" w:eastAsia="Arial" w:hAnsiTheme="minorHAnsi" w:cs="Segoe UI"/>
                 <w:color w:val="1A1A1A"/>
               </w:rPr>
               <w:t>E-mail: {EMAIL}</w:t>
@@ -365,12 +343,12 @@
               <w:spacing w:before="80" w:after="80"/>
               <w:jc w:val="both"/>
               <w:rPr>
-                <w:rFonts w:ascii="Segoe UI" w:hAnsi="Segoe UI" w:cs="Segoe UI"/>
+                <w:rFonts w:asciiTheme="minorHAnsi" w:hAnsiTheme="minorHAnsi" w:cs="Segoe UI"/>
               </w:rPr>
             </w:pPr>
             <w:r>
               <w:rPr>
-                <w:rFonts w:ascii="Segoe UI" w:eastAsia="Arial" w:hAnsi="Segoe UI" w:cs="Segoe UI"/>
+                <w:rFonts w:asciiTheme="minorHAnsi" w:eastAsia="Arial" w:hAnsiTheme="minorHAnsi" w:cs="Segoe UI"/>
                 <w:color w:val="1A1A1A"/>
               </w:rPr>
               <w:t>Telefone: {TELEFONE}</w:t>
@@ -383,21 +361,21 @@
       <w:pPr>
         <w:spacing w:before="200"/>
         <w:rPr>
-          <w:rFonts w:ascii="Segoe UI" w:hAnsi="Segoe UI" w:cs="Segoe UI"/>
-        </w:rPr>
-      </w:pPr>
-    </w:p>
-    <w:p>
-      <w:pPr>
-        <w:spacing w:before="80" w:after="80"/>
-        <w:jc w:val="both"/>
-        <w:rPr>
-          <w:rFonts w:ascii="Segoe UI" w:hAnsi="Segoe UI" w:cs="Segoe UI"/>
-        </w:rPr>
-      </w:pPr>
-      <w:r>
-        <w:rPr>
-          <w:rFonts w:ascii="Segoe UI" w:eastAsia="Arial" w:hAnsi="Segoe UI" w:cs="Segoe UI"/>
+          <w:rFonts w:asciiTheme="minorHAnsi" w:hAnsiTheme="minorHAnsi" w:cs="Segoe UI"/>
+        </w:rPr>
+      </w:pPr>
+    </w:p>
+    <w:p>
+      <w:pPr>
+        <w:spacing w:before="80" w:after="80"/>
+        <w:jc w:val="both"/>
+        <w:rPr>
+          <w:rFonts w:asciiTheme="minorHAnsi" w:hAnsiTheme="minorHAnsi" w:cs="Segoe UI"/>
+        </w:rPr>
+      </w:pPr>
+      <w:r>
+        <w:rPr>
+          <w:rFonts w:asciiTheme="minorHAnsi" w:eastAsia="Arial" w:hAnsiTheme="minorHAnsi" w:cs="Segoe UI"/>
           <w:i/>
           <w:iCs/>
           <w:color w:val="1A1A1A"/>
@@ -412,12 +390,12 @@
         </w:pBdr>
         <w:spacing w:before="300" w:after="120"/>
         <w:rPr>
-          <w:rFonts w:ascii="Segoe UI" w:hAnsi="Segoe UI" w:cs="Segoe UI"/>
-        </w:rPr>
-      </w:pPr>
-      <w:r>
-        <w:rPr>
-          <w:rFonts w:ascii="Segoe UI" w:eastAsia="Arial" w:hAnsi="Segoe UI" w:cs="Segoe UI"/>
+          <w:rFonts w:asciiTheme="minorHAnsi" w:hAnsiTheme="minorHAnsi" w:cs="Segoe UI"/>
+        </w:rPr>
+      </w:pPr>
+      <w:r>
+        <w:rPr>
+          <w:rFonts w:asciiTheme="minorHAnsi" w:eastAsia="Arial" w:hAnsiTheme="minorHAnsi" w:cs="Segoe UI"/>
           <w:b/>
           <w:bCs/>
           <w:color w:val="2B4D6E"/>
@@ -432,12 +410,12 @@
         <w:spacing w:before="80" w:after="80"/>
         <w:jc w:val="both"/>
         <w:rPr>
-          <w:rFonts w:ascii="Segoe UI" w:hAnsi="Segoe UI" w:cs="Segoe UI"/>
-        </w:rPr>
-      </w:pPr>
-      <w:r>
-        <w:rPr>
-          <w:rFonts w:ascii="Segoe UI" w:eastAsia="Arial" w:hAnsi="Segoe UI" w:cs="Segoe UI"/>
+          <w:rFonts w:asciiTheme="minorHAnsi" w:hAnsiTheme="minorHAnsi" w:cs="Segoe UI"/>
+        </w:rPr>
+      </w:pPr>
+      <w:r>
+        <w:rPr>
+          <w:rFonts w:asciiTheme="minorHAnsi" w:eastAsia="Arial" w:hAnsiTheme="minorHAnsi" w:cs="Segoe UI"/>
           <w:color w:val="1A1A1A"/>
         </w:rPr>
         <w:t>O presente contrato tem por objeto a prestação de serviços especializados de gestão comercial e estratégia de lançamento imobiliário pela CONTRATADA, envolvendo as seguintes atividades:</w:t>
@@ -452,12 +430,12 @@
         </w:numPr>
         <w:spacing w:before="60" w:after="60"/>
         <w:rPr>
-          <w:rFonts w:ascii="Segoe UI" w:hAnsi="Segoe UI" w:cs="Segoe UI"/>
-        </w:rPr>
-      </w:pPr>
-      <w:r>
-        <w:rPr>
-          <w:rFonts w:ascii="Segoe UI" w:eastAsia="Arial" w:hAnsi="Segoe UI" w:cs="Segoe UI"/>
+          <w:rFonts w:asciiTheme="minorHAnsi" w:hAnsiTheme="minorHAnsi" w:cs="Segoe UI"/>
+        </w:rPr>
+      </w:pPr>
+      <w:r>
+        <w:rPr>
+          <w:rFonts w:asciiTheme="minorHAnsi" w:eastAsia="Arial" w:hAnsiTheme="minorHAnsi" w:cs="Segoe UI"/>
           <w:color w:val="1A1A1A"/>
         </w:rPr>
         <w:t>Diagnóstico Estratégico: estudo da vocação do terreno, público-alvo e potencial comercial; análise de contexto e cenário para posicionamento estratégico.</w:t>
@@ -472,12 +450,12 @@
         </w:numPr>
         <w:spacing w:before="60" w:after="60"/>
         <w:rPr>
-          <w:rFonts w:ascii="Segoe UI" w:hAnsi="Segoe UI" w:cs="Segoe UI"/>
-        </w:rPr>
-      </w:pPr>
-      <w:r>
-        <w:rPr>
-          <w:rFonts w:ascii="Segoe UI" w:eastAsia="Arial" w:hAnsi="Segoe UI" w:cs="Segoe UI"/>
+          <w:rFonts w:asciiTheme="minorHAnsi" w:hAnsiTheme="minorHAnsi" w:cs="Segoe UI"/>
+        </w:rPr>
+      </w:pPr>
+      <w:r>
+        <w:rPr>
+          <w:rFonts w:asciiTheme="minorHAnsi" w:eastAsia="Arial" w:hAnsiTheme="minorHAnsi" w:cs="Segoe UI"/>
           <w:color w:val="1A1A1A"/>
         </w:rPr>
         <w:t>Viabilidade Comercial: estudo aprofundado de mercado, preços, demanda e cenários de viabilidade.</w:t>
@@ -492,12 +470,12 @@
         </w:numPr>
         <w:spacing w:before="60" w:after="60"/>
         <w:rPr>
-          <w:rFonts w:ascii="Segoe UI" w:hAnsi="Segoe UI" w:cs="Segoe UI"/>
-        </w:rPr>
-      </w:pPr>
-      <w:r>
-        <w:rPr>
-          <w:rFonts w:ascii="Segoe UI" w:eastAsia="Arial" w:hAnsi="Segoe UI" w:cs="Segoe UI"/>
+          <w:rFonts w:asciiTheme="minorHAnsi" w:hAnsiTheme="minorHAnsi" w:cs="Segoe UI"/>
+        </w:rPr>
+      </w:pPr>
+      <w:r>
+        <w:rPr>
+          <w:rFonts w:asciiTheme="minorHAnsi" w:eastAsia="Arial" w:hAnsiTheme="minorHAnsi" w:cs="Segoe UI"/>
           <w:color w:val="1A1A1A"/>
         </w:rPr>
         <w:t>Posicionamento e Marca: assessoria técnica à agência de publicidade na criação de nome, conceito, identidade visual e narrativa comercial.</w:t>
@@ -512,12 +490,12 @@
         </w:numPr>
         <w:spacing w:before="60" w:after="60"/>
         <w:rPr>
-          <w:rFonts w:ascii="Segoe UI" w:hAnsi="Segoe UI" w:cs="Segoe UI"/>
-        </w:rPr>
-      </w:pPr>
-      <w:r>
-        <w:rPr>
-          <w:rFonts w:ascii="Segoe UI" w:eastAsia="Arial" w:hAnsi="Segoe UI" w:cs="Segoe UI"/>
+          <w:rFonts w:asciiTheme="minorHAnsi" w:hAnsiTheme="minorHAnsi" w:cs="Segoe UI"/>
+        </w:rPr>
+      </w:pPr>
+      <w:r>
+        <w:rPr>
+          <w:rFonts w:asciiTheme="minorHAnsi" w:eastAsia="Arial" w:hAnsiTheme="minorHAnsi" w:cs="Segoe UI"/>
           <w:color w:val="1A1A1A"/>
         </w:rPr>
         <w:t>Plano de Lançamento: desenvolvimento de plano estratégico de vendas e cronograma de ações.</w:t>
@@ -532,12 +510,12 @@
         </w:numPr>
         <w:spacing w:before="60" w:after="60"/>
         <w:rPr>
-          <w:rFonts w:ascii="Segoe UI" w:hAnsi="Segoe UI" w:cs="Segoe UI"/>
-        </w:rPr>
-      </w:pPr>
-      <w:r>
-        <w:rPr>
-          <w:rFonts w:ascii="Segoe UI" w:eastAsia="Arial" w:hAnsi="Segoe UI" w:cs="Segoe UI"/>
+          <w:rFonts w:asciiTheme="minorHAnsi" w:hAnsiTheme="minorHAnsi" w:cs="Segoe UI"/>
+        </w:rPr>
+      </w:pPr>
+      <w:r>
+        <w:rPr>
+          <w:rFonts w:asciiTheme="minorHAnsi" w:eastAsia="Arial" w:hAnsiTheme="minorHAnsi" w:cs="Segoe UI"/>
           <w:color w:val="1A1A1A"/>
         </w:rPr>
         <w:t>Ativação Comercial: supervisão de campanhas e desenvolvimento de canais de geração de leads.</w:t>
@@ -552,12 +530,12 @@
         </w:numPr>
         <w:spacing w:before="60" w:after="60"/>
         <w:rPr>
-          <w:rFonts w:ascii="Segoe UI" w:hAnsi="Segoe UI" w:cs="Segoe UI"/>
-        </w:rPr>
-      </w:pPr>
-      <w:r>
-        <w:rPr>
-          <w:rFonts w:ascii="Segoe UI" w:eastAsia="Arial" w:hAnsi="Segoe UI" w:cs="Segoe UI"/>
+          <w:rFonts w:asciiTheme="minorHAnsi" w:hAnsiTheme="minorHAnsi" w:cs="Segoe UI"/>
+        </w:rPr>
+      </w:pPr>
+      <w:r>
+        <w:rPr>
+          <w:rFonts w:asciiTheme="minorHAnsi" w:eastAsia="Arial" w:hAnsiTheme="minorHAnsi" w:cs="Segoe UI"/>
           <w:color w:val="1A1A1A"/>
         </w:rPr>
         <w:t>Gestão de Vendas: estruturação do fluxo comercial e elaboração de relatórios mensais.</w:t>
@@ -572,12 +550,12 @@
         </w:numPr>
         <w:spacing w:before="60" w:after="60"/>
         <w:rPr>
-          <w:rFonts w:ascii="Segoe UI" w:hAnsi="Segoe UI" w:cs="Segoe UI"/>
-        </w:rPr>
-      </w:pPr>
-      <w:r>
-        <w:rPr>
-          <w:rFonts w:ascii="Segoe UI" w:eastAsia="Arial" w:hAnsi="Segoe UI" w:cs="Segoe UI"/>
+          <w:rFonts w:asciiTheme="minorHAnsi" w:hAnsiTheme="minorHAnsi" w:cs="Segoe UI"/>
+        </w:rPr>
+      </w:pPr>
+      <w:r>
+        <w:rPr>
+          <w:rFonts w:asciiTheme="minorHAnsi" w:eastAsia="Arial" w:hAnsiTheme="minorHAnsi" w:cs="Segoe UI"/>
           <w:color w:val="1A1A1A"/>
         </w:rPr>
         <w:t>Treinamento: seleção, capacitação e treinamento de corretores parceiros.</w:t>
@@ -592,12 +570,12 @@
         </w:numPr>
         <w:spacing w:before="60" w:after="60"/>
         <w:rPr>
-          <w:rFonts w:ascii="Segoe UI" w:hAnsi="Segoe UI" w:cs="Segoe UI"/>
-        </w:rPr>
-      </w:pPr>
-      <w:r>
-        <w:rPr>
-          <w:rFonts w:ascii="Segoe UI" w:eastAsia="Arial" w:hAnsi="Segoe UI" w:cs="Segoe UI"/>
+          <w:rFonts w:asciiTheme="minorHAnsi" w:hAnsiTheme="minorHAnsi" w:cs="Segoe UI"/>
+        </w:rPr>
+      </w:pPr>
+      <w:r>
+        <w:rPr>
+          <w:rFonts w:asciiTheme="minorHAnsi" w:eastAsia="Arial" w:hAnsiTheme="minorHAnsi" w:cs="Segoe UI"/>
           <w:color w:val="1A1A1A"/>
         </w:rPr>
         <w:t>Operação de Lançamento: gestão comercial integral do atendimento ao fechamento do negócio.</w:t>
@@ -608,12 +586,12 @@
         <w:spacing w:before="80" w:after="80"/>
         <w:jc w:val="both"/>
         <w:rPr>
-          <w:rFonts w:ascii="Segoe UI" w:hAnsi="Segoe UI" w:cs="Segoe UI"/>
-        </w:rPr>
-      </w:pPr>
-      <w:r>
-        <w:rPr>
-          <w:rFonts w:ascii="Segoe UI" w:eastAsia="Arial" w:hAnsi="Segoe UI" w:cs="Segoe UI"/>
+          <w:rFonts w:asciiTheme="minorHAnsi" w:hAnsiTheme="minorHAnsi" w:cs="Segoe UI"/>
+        </w:rPr>
+      </w:pPr>
+      <w:r>
+        <w:rPr>
+          <w:rFonts w:asciiTheme="minorHAnsi" w:eastAsia="Arial" w:hAnsiTheme="minorHAnsi" w:cs="Segoe UI"/>
           <w:i/>
           <w:iCs/>
           <w:color w:val="1A1A1A"/>
@@ -628,12 +606,12 @@
         </w:pBdr>
         <w:spacing w:before="300" w:after="120"/>
         <w:rPr>
-          <w:rFonts w:ascii="Segoe UI" w:hAnsi="Segoe UI" w:cs="Segoe UI"/>
-        </w:rPr>
-      </w:pPr>
-      <w:r>
-        <w:rPr>
-          <w:rFonts w:ascii="Segoe UI" w:eastAsia="Arial" w:hAnsi="Segoe UI" w:cs="Segoe UI"/>
+          <w:rFonts w:asciiTheme="minorHAnsi" w:hAnsiTheme="minorHAnsi" w:cs="Segoe UI"/>
+        </w:rPr>
+      </w:pPr>
+      <w:r>
+        <w:rPr>
+          <w:rFonts w:asciiTheme="minorHAnsi" w:eastAsia="Arial" w:hAnsiTheme="minorHAnsi" w:cs="Segoe UI"/>
           <w:b/>
           <w:bCs/>
           <w:color w:val="2B4D6E"/>
@@ -648,12 +626,12 @@
         <w:spacing w:before="80" w:after="80"/>
         <w:jc w:val="both"/>
         <w:rPr>
-          <w:rFonts w:ascii="Segoe UI" w:hAnsi="Segoe UI" w:cs="Segoe UI"/>
-        </w:rPr>
-      </w:pPr>
-      <w:r>
-        <w:rPr>
-          <w:rFonts w:ascii="Segoe UI" w:eastAsia="Arial" w:hAnsi="Segoe UI" w:cs="Segoe UI"/>
+          <w:rFonts w:asciiTheme="minorHAnsi" w:hAnsiTheme="minorHAnsi" w:cs="Segoe UI"/>
+        </w:rPr>
+      </w:pPr>
+      <w:r>
+        <w:rPr>
+          <w:rFonts w:asciiTheme="minorHAnsi" w:eastAsia="Arial" w:hAnsiTheme="minorHAnsi" w:cs="Segoe UI"/>
           <w:color w:val="1A1A1A"/>
         </w:rPr>
         <w:t xml:space="preserve">O presente contrato refere-se exclusivamente ao empreendimento denominado </w:t>
@@ -664,12 +642,12 @@
         <w:spacing w:before="80" w:after="80"/>
         <w:jc w:val="both"/>
         <w:rPr>
-          <w:rFonts w:ascii="Segoe UI" w:hAnsi="Segoe UI" w:cs="Segoe UI"/>
-        </w:rPr>
-      </w:pPr>
-      <w:r>
-        <w:rPr>
-          <w:rFonts w:ascii="Segoe UI" w:eastAsia="Arial" w:hAnsi="Segoe UI" w:cs="Segoe UI"/>
+          <w:rFonts w:asciiTheme="minorHAnsi" w:hAnsiTheme="minorHAnsi" w:cs="Segoe UI"/>
+        </w:rPr>
+      </w:pPr>
+      <w:r>
+        <w:rPr>
+          <w:rFonts w:asciiTheme="minorHAnsi" w:eastAsia="Arial" w:hAnsiTheme="minorHAnsi" w:cs="Segoe UI"/>
           <w:b/>
           <w:bCs/>
           <w:color w:val="1A1A1A"/>
@@ -678,7 +656,7 @@
       </w:r>
       <w:r>
         <w:rPr>
-          <w:rFonts w:ascii="Segoe UI" w:eastAsia="Arial" w:hAnsi="Segoe UI" w:cs="Segoe UI"/>
+          <w:rFonts w:asciiTheme="minorHAnsi" w:eastAsia="Arial" w:hAnsiTheme="minorHAnsi" w:cs="Segoe UI"/>
           <w:color w:val="1A1A1A"/>
         </w:rPr>
         <w:t>{NOME_EMPREENDIMENTO}</w:t>
@@ -689,12 +667,12 @@
         <w:spacing w:before="80" w:after="80"/>
         <w:jc w:val="both"/>
         <w:rPr>
-          <w:rFonts w:ascii="Segoe UI" w:hAnsi="Segoe UI" w:cs="Segoe UI"/>
-        </w:rPr>
-      </w:pPr>
-      <w:r>
-        <w:rPr>
-          <w:rFonts w:ascii="Segoe UI" w:eastAsia="Arial" w:hAnsi="Segoe UI" w:cs="Segoe UI"/>
+          <w:rFonts w:asciiTheme="minorHAnsi" w:hAnsiTheme="minorHAnsi" w:cs="Segoe UI"/>
+        </w:rPr>
+      </w:pPr>
+      <w:r>
+        <w:rPr>
+          <w:rFonts w:asciiTheme="minorHAnsi" w:eastAsia="Arial" w:hAnsiTheme="minorHAnsi" w:cs="Segoe UI"/>
           <w:b/>
           <w:bCs/>
           <w:color w:val="1A1A1A"/>
@@ -703,7 +681,7 @@
       </w:r>
       <w:r>
         <w:rPr>
-          <w:rFonts w:ascii="Segoe UI" w:eastAsia="Arial" w:hAnsi="Segoe UI" w:cs="Segoe UI"/>
+          <w:rFonts w:asciiTheme="minorHAnsi" w:eastAsia="Arial" w:hAnsiTheme="minorHAnsi" w:cs="Segoe UI"/>
           <w:color w:val="1A1A1A"/>
         </w:rPr>
         <w:t>{ENDERECO_EMPREENDIMENTO}</w:t>
@@ -714,22 +692,21 @@
         <w:spacing w:before="80" w:after="80"/>
         <w:jc w:val="both"/>
         <w:rPr>
-          <w:rFonts w:ascii="Segoe UI" w:hAnsi="Segoe UI" w:cs="Segoe UI"/>
-        </w:rPr>
-      </w:pPr>
-      <w:r>
-        <w:rPr>
-          <w:rFonts w:ascii="Segoe UI" w:eastAsia="Arial" w:hAnsi="Segoe UI" w:cs="Segoe UI"/>
+          <w:rFonts w:asciiTheme="minorHAnsi" w:hAnsiTheme="minorHAnsi" w:cs="Segoe UI"/>
+        </w:rPr>
+      </w:pPr>
+      <w:r>
+        <w:rPr>
+          <w:rFonts w:asciiTheme="minorHAnsi" w:eastAsia="Arial" w:hAnsiTheme="minorHAnsi" w:cs="Segoe UI"/>
           <w:b/>
           <w:bCs/>
           <w:color w:val="1A1A1A"/>
         </w:rPr>
-        <w:lastRenderedPageBreak/>
         <w:t xml:space="preserve">Unidades: </w:t>
       </w:r>
       <w:r>
         <w:rPr>
-          <w:rFonts w:ascii="Segoe UI" w:eastAsia="Arial" w:hAnsi="Segoe UI" w:cs="Segoe UI"/>
+          <w:rFonts w:asciiTheme="minorHAnsi" w:eastAsia="Arial" w:hAnsiTheme="minorHAnsi" w:cs="Segoe UI"/>
           <w:color w:val="1A1A1A"/>
         </w:rPr>
         <w:t>{NUM_UNIDADES}</w:t>
@@ -740,12 +717,12 @@
         <w:spacing w:before="80" w:after="80"/>
         <w:jc w:val="both"/>
         <w:rPr>
-          <w:rFonts w:ascii="Segoe UI" w:hAnsi="Segoe UI" w:cs="Segoe UI"/>
-        </w:rPr>
-      </w:pPr>
-      <w:r>
-        <w:rPr>
-          <w:rFonts w:ascii="Segoe UI" w:eastAsia="Arial" w:hAnsi="Segoe UI" w:cs="Segoe UI"/>
+          <w:rFonts w:asciiTheme="minorHAnsi" w:hAnsiTheme="minorHAnsi" w:cs="Segoe UI"/>
+        </w:rPr>
+      </w:pPr>
+      <w:r>
+        <w:rPr>
+          <w:rFonts w:asciiTheme="minorHAnsi" w:eastAsia="Arial" w:hAnsiTheme="minorHAnsi" w:cs="Segoe UI"/>
           <w:b/>
           <w:bCs/>
           <w:color w:val="1A1A1A"/>
@@ -754,7 +731,7 @@
       </w:r>
       <w:r>
         <w:rPr>
-          <w:rFonts w:ascii="Segoe UI" w:eastAsia="Arial" w:hAnsi="Segoe UI" w:cs="Segoe UI"/>
+          <w:rFonts w:asciiTheme="minorHAnsi" w:eastAsia="Arial" w:hAnsiTheme="minorHAnsi" w:cs="Segoe UI"/>
           <w:color w:val="1A1A1A"/>
         </w:rPr>
         <w:t>R$ {VGV_ESTIMADO}</w:t>
@@ -764,21 +741,21 @@
       <w:pPr>
         <w:spacing w:before="80"/>
         <w:rPr>
-          <w:rFonts w:ascii="Segoe UI" w:hAnsi="Segoe UI" w:cs="Segoe UI"/>
-        </w:rPr>
-      </w:pPr>
-    </w:p>
-    <w:p>
-      <w:pPr>
-        <w:spacing w:before="80" w:after="80"/>
-        <w:jc w:val="both"/>
-        <w:rPr>
-          <w:rFonts w:ascii="Segoe UI" w:hAnsi="Segoe UI" w:cs="Segoe UI"/>
-        </w:rPr>
-      </w:pPr>
-      <w:r>
-        <w:rPr>
-          <w:rFonts w:ascii="Segoe UI" w:eastAsia="Arial" w:hAnsi="Segoe UI" w:cs="Segoe UI"/>
+          <w:rFonts w:asciiTheme="minorHAnsi" w:hAnsiTheme="minorHAnsi" w:cs="Segoe UI"/>
+        </w:rPr>
+      </w:pPr>
+    </w:p>
+    <w:p>
+      <w:pPr>
+        <w:spacing w:before="80" w:after="80"/>
+        <w:jc w:val="both"/>
+        <w:rPr>
+          <w:rFonts w:asciiTheme="minorHAnsi" w:hAnsiTheme="minorHAnsi" w:cs="Segoe UI"/>
+        </w:rPr>
+      </w:pPr>
+      <w:r>
+        <w:rPr>
+          <w:rFonts w:asciiTheme="minorHAnsi" w:eastAsia="Arial" w:hAnsiTheme="minorHAnsi" w:cs="Segoe UI"/>
           <w:i/>
           <w:iCs/>
           <w:color w:val="1A1A1A"/>
@@ -793,12 +770,12 @@
         </w:pBdr>
         <w:spacing w:before="300" w:after="120"/>
         <w:rPr>
-          <w:rFonts w:ascii="Segoe UI" w:hAnsi="Segoe UI" w:cs="Segoe UI"/>
-        </w:rPr>
-      </w:pPr>
-      <w:r>
-        <w:rPr>
-          <w:rFonts w:ascii="Segoe UI" w:eastAsia="Arial" w:hAnsi="Segoe UI" w:cs="Segoe UI"/>
+          <w:rFonts w:asciiTheme="minorHAnsi" w:hAnsiTheme="minorHAnsi" w:cs="Segoe UI"/>
+        </w:rPr>
+      </w:pPr>
+      <w:r>
+        <w:rPr>
+          <w:rFonts w:asciiTheme="minorHAnsi" w:eastAsia="Arial" w:hAnsiTheme="minorHAnsi" w:cs="Segoe UI"/>
           <w:b/>
           <w:bCs/>
           <w:color w:val="2B4D6E"/>
@@ -812,278 +789,202 @@
       <w:pPr>
         <w:spacing w:before="200" w:after="80"/>
         <w:rPr>
-          <w:rFonts w:ascii="Segoe UI" w:hAnsi="Segoe UI" w:cs="Segoe UI"/>
-        </w:rPr>
-      </w:pPr>
-      <w:r>
-        <w:rPr>
-          <w:rFonts w:ascii="Segoe UI" w:eastAsia="Arial" w:hAnsi="Segoe UI" w:cs="Segoe UI"/>
+          <w:rFonts w:asciiTheme="minorHAnsi" w:hAnsiTheme="minorHAnsi" w:cs="Segoe UI"/>
+        </w:rPr>
+      </w:pPr>
+      <w:r>
+        <w:rPr>
+          <w:rFonts w:asciiTheme="minorHAnsi" w:eastAsia="Arial" w:hAnsiTheme="minorHAnsi" w:cs="Segoe UI"/>
           <w:b/>
           <w:bCs/>
           <w:color w:val="1A1A1A"/>
         </w:rPr>
-        <w:t xml:space="preserve">3.1 </w:t>
-      </w:r>
-      <w:proofErr w:type="spellStart"/>
-      <w:r>
-        <w:rPr>
-          <w:rFonts w:ascii="Segoe UI" w:eastAsia="Arial" w:hAnsi="Segoe UI" w:cs="Segoe UI"/>
+        <w:t>3.1 Fee de Instalação e pré-lançamento (Setup)</w:t>
+      </w:r>
+    </w:p>
+    <w:p>
+      <w:pPr>
+        <w:spacing w:before="80" w:after="80"/>
+        <w:jc w:val="both"/>
+        <w:rPr>
+          <w:rFonts w:asciiTheme="minorHAnsi" w:hAnsiTheme="minorHAnsi" w:cs="Segoe UI"/>
+        </w:rPr>
+      </w:pPr>
+      <w:r>
+        <w:rPr>
+          <w:rFonts w:asciiTheme="minorHAnsi" w:eastAsia="Arial" w:hAnsiTheme="minorHAnsi" w:cs="Segoe UI"/>
+          <w:color w:val="1A1A1A"/>
+        </w:rPr>
+        <w:t>A CONTRATANTE pagará à CONTRATADA o valor de R$ 10.000,00 (dez mil reais) mensais durante os 3 (três) meses que antecedem o lançamento, totalizando R$ 30.000,00 (trinta mil reais). Este valor é não reembolsável e remunera o trabalho estratégico de pré-lançamento independentemente do volume de vendas.</w:t>
+      </w:r>
+    </w:p>
+    <w:p>
+      <w:pPr>
+        <w:spacing w:before="200" w:after="80"/>
+        <w:rPr>
+          <w:rFonts w:asciiTheme="minorHAnsi" w:hAnsiTheme="minorHAnsi" w:cs="Segoe UI"/>
+        </w:rPr>
+      </w:pPr>
+      <w:r>
+        <w:rPr>
+          <w:rFonts w:asciiTheme="minorHAnsi" w:eastAsia="Arial" w:hAnsiTheme="minorHAnsi" w:cs="Segoe UI"/>
           <w:b/>
           <w:bCs/>
           <w:color w:val="1A1A1A"/>
         </w:rPr>
-        <w:t>Fee</w:t>
-      </w:r>
-      <w:proofErr w:type="spellEnd"/>
-      <w:r>
-        <w:rPr>
-          <w:rFonts w:ascii="Segoe UI" w:eastAsia="Arial" w:hAnsi="Segoe UI" w:cs="Segoe UI"/>
+        <w:t>3.2 Comissão sobre Vendas</w:t>
+      </w:r>
+    </w:p>
+    <w:p>
+      <w:pPr>
+        <w:spacing w:before="80" w:after="80"/>
+        <w:jc w:val="both"/>
+        <w:rPr>
+          <w:rFonts w:asciiTheme="minorHAnsi" w:hAnsiTheme="minorHAnsi" w:cs="Segoe UI"/>
+        </w:rPr>
+      </w:pPr>
+      <w:r>
+        <w:rPr>
+          <w:rFonts w:asciiTheme="minorHAnsi" w:eastAsia="Arial" w:hAnsiTheme="minorHAnsi" w:cs="Segoe UI"/>
+          <w:color w:val="1A1A1A"/>
+        </w:rPr>
+        <w:t xml:space="preserve">A CONTRATADA fará jus a </w:t>
+      </w:r>
+      <w:r>
+        <w:rPr>
+          <w:rFonts w:asciiTheme="minorHAnsi" w:eastAsia="Arial" w:hAnsiTheme="minorHAnsi" w:cs="Segoe UI"/>
           <w:b/>
           <w:bCs/>
           <w:color w:val="1A1A1A"/>
         </w:rPr>
-        <w:t xml:space="preserve"> de Instalação (Setup)</w:t>
-      </w:r>
-    </w:p>
-    <w:p>
-      <w:pPr>
-        <w:spacing w:before="80" w:after="80"/>
-        <w:jc w:val="both"/>
-        <w:rPr>
-          <w:rFonts w:ascii="Segoe UI" w:hAnsi="Segoe UI" w:cs="Segoe UI"/>
-        </w:rPr>
-      </w:pPr>
-      <w:r>
-        <w:rPr>
-          <w:rFonts w:ascii="Segoe UI" w:eastAsia="Arial" w:hAnsi="Segoe UI" w:cs="Segoe UI"/>
-          <w:color w:val="1A1A1A"/>
-        </w:rPr>
-        <w:t>A CONTRATANTE pagará à CONTRATADA o valor de R$ 10.000,00 (dez mil reais) mensais durante os 3 (três) meses que antecedem o lançamento, totalizando R$ 30.000,00 (trinta mil reais), com primeiro pagamento na data de assinatura deste contrato. Este valor é não reembolsável e remunera o trabalho estratégico de pré-lançamento independentemente do volume de vendas.</w:t>
-      </w:r>
-    </w:p>
-    <w:p>
-      <w:pPr>
-        <w:spacing w:before="200" w:after="80"/>
-        <w:rPr>
-          <w:rFonts w:ascii="Segoe UI" w:hAnsi="Segoe UI" w:cs="Segoe UI"/>
-        </w:rPr>
-      </w:pPr>
-      <w:r>
-        <w:rPr>
-          <w:rFonts w:ascii="Segoe UI" w:eastAsia="Arial" w:hAnsi="Segoe UI" w:cs="Segoe UI"/>
+        <w:t>{PERCENTUAL_R2X} ({PERCENTUAL_EXTENSO} por cento)</w:t>
+      </w:r>
+      <w:r>
+        <w:rPr>
+          <w:rFonts w:asciiTheme="minorHAnsi" w:eastAsia="Arial" w:hAnsiTheme="minorHAnsi" w:cs="Segoe UI"/>
+          <w:color w:val="1A1A1A"/>
+        </w:rPr>
+        <w:t xml:space="preserve"> do Valor Geral de Vendas (VGV) efetivamente realizadas durante o prazo deste contrato, incidindo sobre os valores integrais constantes nos contratos de compra e venda firmados.</w:t>
+      </w:r>
+    </w:p>
+    <w:p>
+      <w:pPr>
+        <w:spacing w:before="100"/>
+        <w:rPr>
+          <w:rFonts w:asciiTheme="minorHAnsi" w:hAnsiTheme="minorHAnsi" w:cs="Segoe UI"/>
+        </w:rPr>
+      </w:pPr>
+    </w:p>
+    <w:p>
+      <w:pPr>
+        <w:spacing w:before="80" w:after="80"/>
+        <w:jc w:val="both"/>
+        <w:rPr>
+          <w:rFonts w:asciiTheme="minorHAnsi" w:hAnsiTheme="minorHAnsi" w:cs="Segoe UI"/>
+        </w:rPr>
+      </w:pPr>
+      <w:r>
+        <w:rPr>
+          <w:rFonts w:asciiTheme="minorHAnsi" w:eastAsia="Arial" w:hAnsiTheme="minorHAnsi" w:cs="Segoe UI"/>
+          <w:color w:val="1A1A1A"/>
+        </w:rPr>
+        <w:t>§ 1º — Independência do pagamento: A obrigação de pagamento da comissão nasce com a assinatura do contrato de venda e pagamento da entrada pelo comprador, sendo devida independentemente de distrato pelo comprador.</w:t>
+      </w:r>
+    </w:p>
+    <w:p>
+      <w:pPr>
+        <w:spacing w:before="80" w:after="80"/>
+        <w:jc w:val="both"/>
+        <w:rPr>
+          <w:rFonts w:asciiTheme="minorHAnsi" w:hAnsiTheme="minorHAnsi" w:cs="Segoe UI"/>
+        </w:rPr>
+      </w:pPr>
+      <w:r>
+        <w:rPr>
+          <w:rFonts w:asciiTheme="minorHAnsi" w:eastAsia="Arial" w:hAnsiTheme="minorHAnsi" w:cs="Segoe UI"/>
+          <w:color w:val="1A1A1A"/>
+        </w:rPr>
+        <w:t>§ 2º — Prazo de pagamento: A comissão será paga mensalmente, até o dia 10 do mês subsequente à assinatura dos contratos de venda e pagamento da entrada, mediante apresentação de relatório mensal pela CONTRATADA e emissão de nota fiscal.</w:t>
+      </w:r>
+    </w:p>
+    <w:p>
+      <w:pPr>
+        <w:spacing w:before="80" w:after="80"/>
+        <w:jc w:val="both"/>
+        <w:rPr>
+          <w:rFonts w:asciiTheme="minorHAnsi" w:hAnsiTheme="minorHAnsi" w:cs="Segoe UI"/>
+        </w:rPr>
+      </w:pPr>
+      <w:r>
+        <w:rPr>
+          <w:rFonts w:asciiTheme="minorHAnsi" w:eastAsia="Arial" w:hAnsiTheme="minorHAnsi" w:cs="Segoe UI"/>
+          <w:color w:val="1A1A1A"/>
+        </w:rPr>
+        <w:t>§ 3º — Lotes pré-vendidos: Lotes negociados antes da assinatura deste contrato e não disponibilizados no lançamento não serão computados para fins de comissão.</w:t>
+      </w:r>
+    </w:p>
+    <w:p>
+      <w:pPr>
+        <w:spacing w:before="80" w:after="80"/>
+        <w:jc w:val="both"/>
+        <w:rPr>
+          <w:rFonts w:asciiTheme="minorHAnsi" w:hAnsiTheme="minorHAnsi" w:cs="Segoe UI"/>
+        </w:rPr>
+      </w:pPr>
+      <w:r>
+        <w:rPr>
+          <w:rFonts w:asciiTheme="minorHAnsi" w:eastAsia="Arial" w:hAnsiTheme="minorHAnsi" w:cs="Segoe UI"/>
+          <w:color w:val="1A1A1A"/>
+        </w:rPr>
+        <w:t>§ 4º — Atraso no pagamento: Em caso de atraso, incidirá multa de 2% sobre o valor devido, acrescida de juros de 1% ao mês pro rata die, sem prejuízo das demais penalidades previstas neste instrumento.</w:t>
+      </w:r>
+    </w:p>
+    <w:p>
+      <w:pPr>
+        <w:spacing w:before="80" w:after="80"/>
+        <w:jc w:val="both"/>
+        <w:rPr>
+          <w:rFonts w:asciiTheme="minorHAnsi" w:hAnsiTheme="minorHAnsi" w:cs="Segoe UI"/>
+        </w:rPr>
+      </w:pPr>
+      <w:r>
+        <w:rPr>
+          <w:rFonts w:asciiTheme="minorHAnsi" w:eastAsia="Arial" w:hAnsiTheme="minorHAnsi" w:cs="Segoe UI"/>
+          <w:color w:val="1A1A1A"/>
+        </w:rPr>
+        <w:t xml:space="preserve">§ 5º — </w:t>
+      </w:r>
+      <w:r>
+        <w:rPr>
+          <w:rFonts w:asciiTheme="minorHAnsi" w:eastAsia="Arial" w:hAnsiTheme="minorHAnsi" w:cs="Segoe UI"/>
           <w:b/>
           <w:bCs/>
           <w:color w:val="1A1A1A"/>
         </w:rPr>
-        <w:t>3.2 Comissão sobre Vendas</w:t>
-      </w:r>
-    </w:p>
-    <w:p>
-      <w:pPr>
-        <w:spacing w:before="80" w:after="80"/>
-        <w:jc w:val="both"/>
-        <w:rPr>
-          <w:rFonts w:ascii="Segoe UI" w:hAnsi="Segoe UI" w:cs="Segoe UI"/>
-        </w:rPr>
-      </w:pPr>
-      <w:r>
-        <w:rPr>
-          <w:rFonts w:ascii="Segoe UI" w:eastAsia="Arial" w:hAnsi="Segoe UI" w:cs="Segoe UI"/>
-          <w:color w:val="1A1A1A"/>
-        </w:rPr>
-        <w:t xml:space="preserve">A CONTRATADA fará jus a </w:t>
-      </w:r>
-      <w:r>
-        <w:rPr>
-          <w:rFonts w:ascii="Segoe UI" w:eastAsia="Arial" w:hAnsi="Segoe UI" w:cs="Segoe UI"/>
-          <w:b/>
-          <w:bCs/>
-          <w:color w:val="1A1A1A"/>
-        </w:rPr>
-        <w:t>{PERCENTUAL_R2X}%</w:t>
-      </w:r>
-      <w:proofErr w:type="gramEnd"/>
-      <w:r>
-        <w:rPr>
-          <w:rFonts w:ascii="Segoe UI" w:eastAsia="Arial" w:hAnsi="Segoe UI" w:cs="Segoe UI"/>
-          <w:b/>
-          <w:bCs/>
-          <w:color w:val="1A1A1A"/>
-        </w:rPr>
-        <w:t xml:space="preserve"> ({PERCENTUAL_EXTENSO} por cento)</w:t>
-      </w:r>
-      <w:r>
-        <w:rPr>
-          <w:rFonts w:ascii="Segoe UI" w:eastAsia="Arial" w:hAnsi="Segoe UI" w:cs="Segoe UI"/>
-          <w:color w:val="1A1A1A"/>
-        </w:rPr>
-        <w:t xml:space="preserve"> do Valor Geral de Vendas (VGV) efetivamente realizadas durante o prazo deste contrato, incidindo sobre os valores integrais constantes nos contratos de compra e venda firmados.</w:t>
-      </w:r>
-    </w:p>
-    <w:p>
-      <w:pPr>
-        <w:spacing w:before="100"/>
-        <w:rPr>
-          <w:rFonts w:ascii="Segoe UI" w:hAnsi="Segoe UI" w:cs="Segoe UI"/>
-        </w:rPr>
-      </w:pPr>
-    </w:p>
-    <w:p>
-      <w:pPr>
-        <w:spacing w:before="80" w:after="80"/>
-        <w:jc w:val="both"/>
-        <w:rPr>
-          <w:rFonts w:ascii="Segoe UI" w:hAnsi="Segoe UI" w:cs="Segoe UI"/>
-        </w:rPr>
-      </w:pPr>
-      <w:r>
-        <w:rPr>
-          <w:rFonts w:ascii="Segoe UI" w:eastAsia="Arial" w:hAnsi="Segoe UI" w:cs="Segoe UI"/>
-          <w:color w:val="1A1A1A"/>
-        </w:rPr>
-        <w:t>§ 1º — Independência do pagamento: A obrigação de pagamento da comissão nasce com a assinatura do contrato de venda</w:t>
-      </w:r>
-      <w:r>
-        <w:rPr>
-          <w:rFonts w:ascii="Segoe UI" w:eastAsia="Arial" w:hAnsi="Segoe UI" w:cs="Segoe UI"/>
-          <w:color w:val="1A1A1A"/>
-        </w:rPr>
-        <w:t xml:space="preserve"> e pagamento da entrada</w:t>
-      </w:r>
-      <w:r>
-        <w:rPr>
-          <w:rFonts w:ascii="Segoe UI" w:eastAsia="Arial" w:hAnsi="Segoe UI" w:cs="Segoe UI"/>
-          <w:color w:val="1A1A1A"/>
-        </w:rPr>
-        <w:t xml:space="preserve"> pelo comprador, sendo devida independentemente de distrato pelo comprador.</w:t>
-      </w:r>
-    </w:p>
-    <w:p>
-      <w:pPr>
-        <w:spacing w:before="80" w:after="80"/>
-        <w:jc w:val="both"/>
-        <w:rPr>
-          <w:rFonts w:ascii="Segoe UI" w:hAnsi="Segoe UI" w:cs="Segoe UI"/>
-        </w:rPr>
-      </w:pPr>
-      <w:r>
-        <w:rPr>
-          <w:rFonts w:ascii="Segoe UI" w:eastAsia="Arial" w:hAnsi="Segoe UI" w:cs="Segoe UI"/>
-          <w:color w:val="1A1A1A"/>
-        </w:rPr>
-        <w:t>§ 2º — Prazo de pagamento: A comissão será paga mensalmente, até o dia 10 do mês subsequente à assinatura dos contratos de venda, mediante apresentação de relatório mensal pela CONTRATADA e emissão de nota fiscal.</w:t>
-      </w:r>
-    </w:p>
-    <w:p>
-      <w:pPr>
-        <w:spacing w:before="80" w:after="80"/>
-        <w:jc w:val="both"/>
-        <w:rPr>
-          <w:rFonts w:ascii="Segoe UI" w:hAnsi="Segoe UI" w:cs="Segoe UI"/>
-        </w:rPr>
-      </w:pPr>
-      <w:r>
-        <w:rPr>
-          <w:rFonts w:ascii="Segoe UI" w:eastAsia="Arial" w:hAnsi="Segoe UI" w:cs="Segoe UI"/>
-          <w:color w:val="1A1A1A"/>
-        </w:rPr>
-        <w:t>§ 3º — Lotes pré-vendidos: Lotes negociados antes da assinatura deste contrato e não disponibilizados no lançamento não serão computados para fins de comissão.</w:t>
-      </w:r>
-    </w:p>
-    <w:p>
-      <w:pPr>
-        <w:spacing w:before="80" w:after="80"/>
-        <w:jc w:val="both"/>
-        <w:rPr>
-          <w:rFonts w:ascii="Segoe UI" w:hAnsi="Segoe UI" w:cs="Segoe UI"/>
-        </w:rPr>
-      </w:pPr>
-      <w:r>
-        <w:rPr>
-          <w:rFonts w:ascii="Segoe UI" w:eastAsia="Arial" w:hAnsi="Segoe UI" w:cs="Segoe UI"/>
-          <w:color w:val="1A1A1A"/>
-        </w:rPr>
-        <w:t>§ 4º — Atraso no pagamento: Em caso de atraso, incidirá multa de 2% sobre o valor devido, acrescida de juros de 1% ao mês pro rata die, sem prejuízo das demais penalidades previstas neste instrumento.</w:t>
-      </w:r>
-    </w:p>
-    <w:p>
-      <w:pPr>
-        <w:spacing w:before="80" w:after="80"/>
-        <w:jc w:val="both"/>
-        <w:rPr>
-          <w:rFonts w:ascii="Segoe UI" w:hAnsi="Segoe UI" w:cs="Segoe UI"/>
-        </w:rPr>
-      </w:pPr>
-      <w:r>
-        <w:rPr>
-          <w:rFonts w:ascii="Segoe UI" w:eastAsia="Arial" w:hAnsi="Segoe UI" w:cs="Segoe UI"/>
-          <w:color w:val="1A1A1A"/>
-        </w:rPr>
-        <w:t xml:space="preserve">§ 5º — Bônus por performance: Caso as vendas superem 50% do VGV total nos primeiros 90 dias do lançamento, a CONTRATANTE pagará à CONTRATADA um </w:t>
-      </w:r>
-      <w:proofErr w:type="gramStart"/>
-      <w:r>
-        <w:rPr>
-          <w:rFonts w:ascii="Segoe UI" w:eastAsia="Arial" w:hAnsi="Segoe UI" w:cs="Segoe UI"/>
-          <w:color w:val="1A1A1A"/>
-        </w:rPr>
-        <w:t>bônus adicional</w:t>
-      </w:r>
-      <w:proofErr w:type="gramEnd"/>
-      <w:r>
-        <w:rPr>
-          <w:rFonts w:ascii="Segoe UI" w:eastAsia="Arial" w:hAnsi="Segoe UI" w:cs="Segoe UI"/>
-          <w:color w:val="1A1A1A"/>
-        </w:rPr>
-        <w:t xml:space="preserve"> de 0,5% sobre o VGV excedente a 50%, a ser pago no prazo de 30 dias após atingida a marca.</w:t>
-      </w:r>
-    </w:p>
-    <w:p>
-      <w:pPr>
-        <w:spacing w:before="80" w:after="80"/>
-        <w:jc w:val="both"/>
-        <w:rPr>
-          <w:rFonts w:ascii="Segoe UI" w:hAnsi="Segoe UI" w:cs="Segoe UI"/>
-        </w:rPr>
-      </w:pPr>
-      <w:r>
-        <w:rPr>
-          <w:rFonts w:ascii="Segoe UI" w:eastAsia="Arial" w:hAnsi="Segoe UI" w:cs="Segoe UI"/>
-          <w:color w:val="1A1A1A"/>
-        </w:rPr>
-        <w:t xml:space="preserve">§ 6º — </w:t>
-      </w:r>
-      <w:proofErr w:type="spellStart"/>
-      <w:r>
-        <w:rPr>
-          <w:rFonts w:ascii="Segoe UI" w:eastAsia="Arial" w:hAnsi="Segoe UI" w:cs="Segoe UI"/>
-          <w:color w:val="1A1A1A"/>
-        </w:rPr>
-        <w:t>Distratos</w:t>
-      </w:r>
-      <w:proofErr w:type="spellEnd"/>
-      <w:r>
-        <w:rPr>
-          <w:rFonts w:ascii="Segoe UI" w:eastAsia="Arial" w:hAnsi="Segoe UI" w:cs="Segoe UI"/>
-          <w:color w:val="1A1A1A"/>
-        </w:rPr>
-        <w:t xml:space="preserve">: Eventuais </w:t>
-      </w:r>
-      <w:proofErr w:type="spellStart"/>
-      <w:r>
-        <w:rPr>
-          <w:rFonts w:ascii="Segoe UI" w:eastAsia="Arial" w:hAnsi="Segoe UI" w:cs="Segoe UI"/>
-          <w:color w:val="1A1A1A"/>
-        </w:rPr>
-        <w:t>distratos</w:t>
-      </w:r>
-      <w:proofErr w:type="spellEnd"/>
-      <w:r>
-        <w:rPr>
-          <w:rFonts w:ascii="Segoe UI" w:eastAsia="Arial" w:hAnsi="Segoe UI" w:cs="Segoe UI"/>
-          <w:color w:val="1A1A1A"/>
-        </w:rPr>
-        <w:t xml:space="preserve"> ou inadimplementos dos compradores não geram obrigação de devolução de valores já recebidos pela CONTRATADA.</w:t>
+        <w:t>Bônus por performance</w:t>
+      </w:r>
+      <w:r>
+        <w:rPr>
+          <w:rFonts w:asciiTheme="minorHAnsi" w:eastAsia="Arial" w:hAnsiTheme="minorHAnsi" w:cs="Segoe UI"/>
+          <w:color w:val="1A1A1A"/>
+        </w:rPr>
+        <w:t>: Caso as vendas superem 60% do VGV total nos primeiros 30 dias do lançamento, a CONTRATANTE pagará à CONTRATADA um bônus adicional de 0,5% sobre o VGV excedente a 60%.</w:t>
+      </w:r>
+    </w:p>
+    <w:p>
+      <w:pPr>
+        <w:spacing w:before="80" w:after="80"/>
+        <w:jc w:val="both"/>
+        <w:rPr>
+          <w:rFonts w:asciiTheme="minorHAnsi" w:hAnsiTheme="minorHAnsi" w:cs="Segoe UI"/>
+        </w:rPr>
+      </w:pPr>
+      <w:r>
+        <w:rPr>
+          <w:rFonts w:asciiTheme="minorHAnsi" w:eastAsia="Arial" w:hAnsiTheme="minorHAnsi" w:cs="Segoe UI"/>
+          <w:color w:val="1A1A1A"/>
+        </w:rPr>
+        <w:t>§ 6º — Distratos: Eventuais distratos ou inadimplementos dos compradores não geram obrigação de devolução de valores já recebidos pela CONTRATADA.</w:t>
       </w:r>
     </w:p>
     <w:p>
@@ -1093,12 +994,12 @@
         </w:pBdr>
         <w:spacing w:before="300" w:after="120"/>
         <w:rPr>
-          <w:rFonts w:ascii="Segoe UI" w:hAnsi="Segoe UI" w:cs="Segoe UI"/>
-        </w:rPr>
-      </w:pPr>
-      <w:r>
-        <w:rPr>
-          <w:rFonts w:ascii="Segoe UI" w:eastAsia="Arial" w:hAnsi="Segoe UI" w:cs="Segoe UI"/>
+          <w:rFonts w:asciiTheme="minorHAnsi" w:hAnsiTheme="minorHAnsi" w:cs="Segoe UI"/>
+        </w:rPr>
+      </w:pPr>
+      <w:r>
+        <w:rPr>
+          <w:rFonts w:asciiTheme="minorHAnsi" w:eastAsia="Arial" w:hAnsiTheme="minorHAnsi" w:cs="Segoe UI"/>
           <w:b/>
           <w:bCs/>
           <w:color w:val="2B4D6E"/>
@@ -1113,12 +1014,12 @@
         <w:spacing w:before="80" w:after="80"/>
         <w:jc w:val="both"/>
         <w:rPr>
-          <w:rFonts w:ascii="Segoe UI" w:hAnsi="Segoe UI" w:cs="Segoe UI"/>
-        </w:rPr>
-      </w:pPr>
-      <w:r>
-        <w:rPr>
-          <w:rFonts w:ascii="Segoe UI" w:eastAsia="Arial" w:hAnsi="Segoe UI" w:cs="Segoe UI"/>
+          <w:rFonts w:asciiTheme="minorHAnsi" w:hAnsiTheme="minorHAnsi" w:cs="Segoe UI"/>
+        </w:rPr>
+      </w:pPr>
+      <w:r>
+        <w:rPr>
+          <w:rFonts w:asciiTheme="minorHAnsi" w:eastAsia="Arial" w:hAnsiTheme="minorHAnsi" w:cs="Segoe UI"/>
           <w:color w:val="1A1A1A"/>
         </w:rPr>
         <w:t>A corretagem das vendas será de 5% (cinco por cento) sobre o valor de cada venda, paga diretamente aos corretores responsáveis, sem intermediação ou retenção pela CONTRATADA.</w:t>
@@ -1129,12 +1030,12 @@
         <w:spacing w:before="80" w:after="80"/>
         <w:jc w:val="both"/>
         <w:rPr>
-          <w:rFonts w:ascii="Segoe UI" w:hAnsi="Segoe UI" w:cs="Segoe UI"/>
-        </w:rPr>
-      </w:pPr>
-      <w:r>
-        <w:rPr>
-          <w:rFonts w:ascii="Segoe UI" w:eastAsia="Arial" w:hAnsi="Segoe UI" w:cs="Segoe UI"/>
+          <w:rFonts w:asciiTheme="minorHAnsi" w:hAnsiTheme="minorHAnsi" w:cs="Segoe UI"/>
+        </w:rPr>
+      </w:pPr>
+      <w:r>
+        <w:rPr>
+          <w:rFonts w:asciiTheme="minorHAnsi" w:eastAsia="Arial" w:hAnsiTheme="minorHAnsi" w:cs="Segoe UI"/>
           <w:i/>
           <w:iCs/>
           <w:color w:val="1A1A1A"/>
@@ -1149,19 +1050,18 @@
         </w:pBdr>
         <w:spacing w:before="300" w:after="120"/>
         <w:rPr>
-          <w:rFonts w:ascii="Segoe UI" w:hAnsi="Segoe UI" w:cs="Segoe UI"/>
-        </w:rPr>
-      </w:pPr>
-      <w:r>
-        <w:rPr>
-          <w:rFonts w:ascii="Segoe UI" w:eastAsia="Arial" w:hAnsi="Segoe UI" w:cs="Segoe UI"/>
+          <w:rFonts w:asciiTheme="minorHAnsi" w:hAnsiTheme="minorHAnsi" w:cs="Segoe UI"/>
+        </w:rPr>
+      </w:pPr>
+      <w:r>
+        <w:rPr>
+          <w:rFonts w:asciiTheme="minorHAnsi" w:eastAsia="Arial" w:hAnsiTheme="minorHAnsi" w:cs="Segoe UI"/>
           <w:b/>
           <w:bCs/>
           <w:color w:val="2B4D6E"/>
           <w:sz w:val="22"/>
           <w:szCs w:val="22"/>
         </w:rPr>
-        <w:lastRenderedPageBreak/>
         <w:t>CLÁUSULA QUINTA — DA EXCLUSIVIDADE E BASE DE LEADS</w:t>
       </w:r>
     </w:p>
@@ -1170,12 +1070,12 @@
         <w:spacing w:before="80" w:after="80"/>
         <w:jc w:val="both"/>
         <w:rPr>
-          <w:rFonts w:ascii="Segoe UI" w:hAnsi="Segoe UI" w:cs="Segoe UI"/>
-        </w:rPr>
-      </w:pPr>
-      <w:r>
-        <w:rPr>
-          <w:rFonts w:ascii="Segoe UI" w:eastAsia="Arial" w:hAnsi="Segoe UI" w:cs="Segoe UI"/>
+          <w:rFonts w:asciiTheme="minorHAnsi" w:hAnsiTheme="minorHAnsi" w:cs="Segoe UI"/>
+        </w:rPr>
+      </w:pPr>
+      <w:r>
+        <w:rPr>
+          <w:rFonts w:asciiTheme="minorHAnsi" w:eastAsia="Arial" w:hAnsiTheme="minorHAnsi" w:cs="Segoe UI"/>
           <w:color w:val="1A1A1A"/>
         </w:rPr>
         <w:t>5.1 Não haverá exclusividade de prestação de serviços. A CONTRATADA poderá atuar simultaneamente em outros empreendimentos.</w:t>
@@ -1186,12 +1086,12 @@
         <w:spacing w:before="80" w:after="80"/>
         <w:jc w:val="both"/>
         <w:rPr>
-          <w:rFonts w:ascii="Segoe UI" w:hAnsi="Segoe UI" w:cs="Segoe UI"/>
-        </w:rPr>
-      </w:pPr>
-      <w:r>
-        <w:rPr>
-          <w:rFonts w:ascii="Segoe UI" w:eastAsia="Arial" w:hAnsi="Segoe UI" w:cs="Segoe UI"/>
+          <w:rFonts w:asciiTheme="minorHAnsi" w:hAnsiTheme="minorHAnsi" w:cs="Segoe UI"/>
+        </w:rPr>
+      </w:pPr>
+      <w:r>
+        <w:rPr>
+          <w:rFonts w:asciiTheme="minorHAnsi" w:eastAsia="Arial" w:hAnsiTheme="minorHAnsi" w:cs="Segoe UI"/>
           <w:color w:val="1A1A1A"/>
         </w:rPr>
         <w:t>5.2 A CONTRATADA poderá e deverá estabelecer relacionamento com todo o mercado de corretores da região, visando à máxima capilaridade e eficiência nas vendas.</w:t>
@@ -1201,12 +1101,12 @@
       <w:pPr>
         <w:spacing w:before="200" w:after="80"/>
         <w:rPr>
-          <w:rFonts w:ascii="Segoe UI" w:hAnsi="Segoe UI" w:cs="Segoe UI"/>
-        </w:rPr>
-      </w:pPr>
-      <w:r>
-        <w:rPr>
-          <w:rFonts w:ascii="Segoe UI" w:eastAsia="Arial" w:hAnsi="Segoe UI" w:cs="Segoe UI"/>
+          <w:rFonts w:asciiTheme="minorHAnsi" w:hAnsiTheme="minorHAnsi" w:cs="Segoe UI"/>
+        </w:rPr>
+      </w:pPr>
+      <w:r>
+        <w:rPr>
+          <w:rFonts w:asciiTheme="minorHAnsi" w:eastAsia="Arial" w:hAnsiTheme="minorHAnsi" w:cs="Segoe UI"/>
           <w:b/>
           <w:bCs/>
           <w:color w:val="1A1A1A"/>
@@ -1219,53 +1119,16 @@
         <w:spacing w:before="80" w:after="80"/>
         <w:jc w:val="both"/>
         <w:rPr>
-          <w:rFonts w:ascii="Segoe UI" w:hAnsi="Segoe UI" w:cs="Segoe UI"/>
-        </w:rPr>
-      </w:pPr>
-      <w:r>
-        <w:rPr>
-          <w:rFonts w:ascii="Segoe UI" w:eastAsia="Arial" w:hAnsi="Segoe UI" w:cs="Segoe UI"/>
-          <w:color w:val="1A1A1A"/>
-        </w:rPr>
-        <w:t>Toda a base de dados de leads gerada durante a vigência deste contrato — incluindo nome, contato, histórico de atendimento e perfil do comprador — é propriedade da CONTRATADA (R2X), podendo ser utilizada em outros empreendimentos. A CONTRATANTE terá acesso às informações de todos os leads a qualquer momento durante a vigência do contrato.</w:t>
-      </w:r>
-    </w:p>
-    <w:p>
-      <w:pPr>
-        <w:spacing w:before="80" w:after="80"/>
-        <w:jc w:val="both"/>
-        <w:rPr>
-          <w:rFonts w:ascii="Segoe UI" w:hAnsi="Segoe UI" w:cs="Segoe UI"/>
-        </w:rPr>
-      </w:pPr>
-      <w:r>
-        <w:rPr>
-          <w:rFonts w:ascii="Segoe UI" w:eastAsia="Arial" w:hAnsi="Segoe UI" w:cs="Segoe UI"/>
-          <w:i/>
-          <w:iCs/>
-          <w:color w:val="1A1A1A"/>
-        </w:rPr>
-        <w:t xml:space="preserve">§ Único — Vedação ao </w:t>
-      </w:r>
-      <w:proofErr w:type="spellStart"/>
-      <w:r>
-        <w:rPr>
-          <w:rFonts w:ascii="Segoe UI" w:eastAsia="Arial" w:hAnsi="Segoe UI" w:cs="Segoe UI"/>
-          <w:i/>
-          <w:iCs/>
-          <w:color w:val="1A1A1A"/>
-        </w:rPr>
-        <w:t>bypass</w:t>
-      </w:r>
-      <w:proofErr w:type="spellEnd"/>
-      <w:r>
-        <w:rPr>
-          <w:rFonts w:ascii="Segoe UI" w:eastAsia="Arial" w:hAnsi="Segoe UI" w:cs="Segoe UI"/>
-          <w:i/>
-          <w:iCs/>
-          <w:color w:val="1A1A1A"/>
-        </w:rPr>
-        <w:t>: É expressamente vedado à CONTRATANTE contatar diretamente os corretores parceiros indicados pela CONTRATADA para negociar condições comerciais fora do escopo deste contrato, durante a vigência e por 12 meses após o encerramento. O descumprimento sujeita a CONTRATANTE à multa equivalente a 1% do VGV total do empreendimento.</w:t>
+          <w:rFonts w:asciiTheme="minorHAnsi" w:hAnsiTheme="minorHAnsi" w:cs="Segoe UI"/>
+        </w:rPr>
+      </w:pPr>
+      <w:r>
+        <w:rPr>
+          <w:rFonts w:asciiTheme="minorHAnsi" w:eastAsia="Arial" w:hAnsiTheme="minorHAnsi" w:cs="Segoe UI"/>
+          <w:color w:val="1A1A1A"/>
+        </w:rPr>
+        <w:lastRenderedPageBreak/>
+        <w:t>Toda a base de dados de leads gerada durante a vigência deste contrato — incluindo nome, contato, histórico de atendimento e perfil do comprador — é propriedade conjunta da CONTRATADA (R2X) e da CONTRATANTE que terá acesso às informações de todos os leads a qualquer momento durante a vigência do contrato.</w:t>
       </w:r>
     </w:p>
     <w:p>
@@ -1275,12 +1138,12 @@
         </w:pBdr>
         <w:spacing w:before="300" w:after="120"/>
         <w:rPr>
-          <w:rFonts w:ascii="Segoe UI" w:hAnsi="Segoe UI" w:cs="Segoe UI"/>
-        </w:rPr>
-      </w:pPr>
-      <w:r>
-        <w:rPr>
-          <w:rFonts w:ascii="Segoe UI" w:eastAsia="Arial" w:hAnsi="Segoe UI" w:cs="Segoe UI"/>
+          <w:rFonts w:asciiTheme="minorHAnsi" w:hAnsiTheme="minorHAnsi" w:cs="Segoe UI"/>
+        </w:rPr>
+      </w:pPr>
+      <w:r>
+        <w:rPr>
+          <w:rFonts w:asciiTheme="minorHAnsi" w:eastAsia="Arial" w:hAnsiTheme="minorHAnsi" w:cs="Segoe UI"/>
           <w:b/>
           <w:bCs/>
           <w:color w:val="2B4D6E"/>
@@ -1294,12 +1157,12 @@
       <w:pPr>
         <w:spacing w:before="200" w:after="80"/>
         <w:rPr>
-          <w:rFonts w:ascii="Segoe UI" w:hAnsi="Segoe UI" w:cs="Segoe UI"/>
-        </w:rPr>
-      </w:pPr>
-      <w:r>
-        <w:rPr>
-          <w:rFonts w:ascii="Segoe UI" w:eastAsia="Arial" w:hAnsi="Segoe UI" w:cs="Segoe UI"/>
+          <w:rFonts w:asciiTheme="minorHAnsi" w:hAnsiTheme="minorHAnsi" w:cs="Segoe UI"/>
+        </w:rPr>
+      </w:pPr>
+      <w:r>
+        <w:rPr>
+          <w:rFonts w:asciiTheme="minorHAnsi" w:eastAsia="Arial" w:hAnsiTheme="minorHAnsi" w:cs="Segoe UI"/>
           <w:b/>
           <w:bCs/>
           <w:color w:val="1A1A1A"/>
@@ -1316,12 +1179,12 @@
         </w:numPr>
         <w:spacing w:before="60" w:after="60"/>
         <w:rPr>
-          <w:rFonts w:ascii="Segoe UI" w:hAnsi="Segoe UI" w:cs="Segoe UI"/>
-        </w:rPr>
-      </w:pPr>
-      <w:r>
-        <w:rPr>
-          <w:rFonts w:ascii="Segoe UI" w:eastAsia="Arial" w:hAnsi="Segoe UI" w:cs="Segoe UI"/>
+          <w:rFonts w:asciiTheme="minorHAnsi" w:hAnsiTheme="minorHAnsi" w:cs="Segoe UI"/>
+        </w:rPr>
+      </w:pPr>
+      <w:r>
+        <w:rPr>
+          <w:rFonts w:asciiTheme="minorHAnsi" w:eastAsia="Arial" w:hAnsiTheme="minorHAnsi" w:cs="Segoe UI"/>
           <w:color w:val="1A1A1A"/>
         </w:rPr>
         <w:t>Prestar os serviços com excelência técnica e profissionalismo.</w:t>
@@ -1336,12 +1199,12 @@
         </w:numPr>
         <w:spacing w:before="60" w:after="60"/>
         <w:rPr>
-          <w:rFonts w:ascii="Segoe UI" w:hAnsi="Segoe UI" w:cs="Segoe UI"/>
-        </w:rPr>
-      </w:pPr>
-      <w:r>
-        <w:rPr>
-          <w:rFonts w:ascii="Segoe UI" w:eastAsia="Arial" w:hAnsi="Segoe UI" w:cs="Segoe UI"/>
+          <w:rFonts w:asciiTheme="minorHAnsi" w:hAnsiTheme="minorHAnsi" w:cs="Segoe UI"/>
+        </w:rPr>
+      </w:pPr>
+      <w:r>
+        <w:rPr>
+          <w:rFonts w:asciiTheme="minorHAnsi" w:eastAsia="Arial" w:hAnsiTheme="minorHAnsi" w:cs="Segoe UI"/>
           <w:color w:val="1A1A1A"/>
         </w:rPr>
         <w:t>Gerir e supervisionar todas as ações previstas no plano de marketing e vendas.</w:t>
@@ -1356,12 +1219,12 @@
         </w:numPr>
         <w:spacing w:before="60" w:after="60"/>
         <w:rPr>
-          <w:rFonts w:ascii="Segoe UI" w:hAnsi="Segoe UI" w:cs="Segoe UI"/>
-        </w:rPr>
-      </w:pPr>
-      <w:r>
-        <w:rPr>
-          <w:rFonts w:ascii="Segoe UI" w:eastAsia="Arial" w:hAnsi="Segoe UI" w:cs="Segoe UI"/>
+          <w:rFonts w:asciiTheme="minorHAnsi" w:hAnsiTheme="minorHAnsi" w:cs="Segoe UI"/>
+        </w:rPr>
+      </w:pPr>
+      <w:r>
+        <w:rPr>
+          <w:rFonts w:asciiTheme="minorHAnsi" w:eastAsia="Arial" w:hAnsiTheme="minorHAnsi" w:cs="Segoe UI"/>
           <w:color w:val="1A1A1A"/>
         </w:rPr>
         <w:t>Apresentar relatório mensal de performance com dados de leads, visitas e vendas.</w:t>
@@ -1376,12 +1239,12 @@
         </w:numPr>
         <w:spacing w:before="60" w:after="60"/>
         <w:rPr>
-          <w:rFonts w:ascii="Segoe UI" w:hAnsi="Segoe UI" w:cs="Segoe UI"/>
-        </w:rPr>
-      </w:pPr>
-      <w:r>
-        <w:rPr>
-          <w:rFonts w:ascii="Segoe UI" w:eastAsia="Arial" w:hAnsi="Segoe UI" w:cs="Segoe UI"/>
+          <w:rFonts w:asciiTheme="minorHAnsi" w:hAnsiTheme="minorHAnsi" w:cs="Segoe UI"/>
+        </w:rPr>
+      </w:pPr>
+      <w:r>
+        <w:rPr>
+          <w:rFonts w:asciiTheme="minorHAnsi" w:eastAsia="Arial" w:hAnsiTheme="minorHAnsi" w:cs="Segoe UI"/>
           <w:color w:val="1A1A1A"/>
         </w:rPr>
         <w:t>Fornecer acesso à base de leads gerada para fins de relatório ao CONTRATANTE.</w:t>
@@ -1392,12 +1255,12 @@
         <w:spacing w:before="80" w:after="80"/>
         <w:jc w:val="both"/>
         <w:rPr>
-          <w:rFonts w:ascii="Segoe UI" w:hAnsi="Segoe UI" w:cs="Segoe UI"/>
-        </w:rPr>
-      </w:pPr>
-      <w:r>
-        <w:rPr>
-          <w:rFonts w:ascii="Segoe UI" w:eastAsia="Arial" w:hAnsi="Segoe UI" w:cs="Segoe UI"/>
+          <w:rFonts w:asciiTheme="minorHAnsi" w:hAnsiTheme="minorHAnsi" w:cs="Segoe UI"/>
+        </w:rPr>
+      </w:pPr>
+      <w:r>
+        <w:rPr>
+          <w:rFonts w:asciiTheme="minorHAnsi" w:eastAsia="Arial" w:hAnsiTheme="minorHAnsi" w:cs="Segoe UI"/>
           <w:i/>
           <w:iCs/>
           <w:color w:val="1A1A1A"/>
@@ -1409,12 +1272,12 @@
       <w:pPr>
         <w:spacing w:before="200" w:after="80"/>
         <w:rPr>
-          <w:rFonts w:ascii="Segoe UI" w:hAnsi="Segoe UI" w:cs="Segoe UI"/>
-        </w:rPr>
-      </w:pPr>
-      <w:r>
-        <w:rPr>
-          <w:rFonts w:ascii="Segoe UI" w:eastAsia="Arial" w:hAnsi="Segoe UI" w:cs="Segoe UI"/>
+          <w:rFonts w:asciiTheme="minorHAnsi" w:hAnsiTheme="minorHAnsi" w:cs="Segoe UI"/>
+        </w:rPr>
+      </w:pPr>
+      <w:r>
+        <w:rPr>
+          <w:rFonts w:asciiTheme="minorHAnsi" w:eastAsia="Arial" w:hAnsiTheme="minorHAnsi" w:cs="Segoe UI"/>
           <w:b/>
           <w:bCs/>
           <w:color w:val="1A1A1A"/>
@@ -1431,31 +1294,15 @@
         </w:numPr>
         <w:spacing w:before="60" w:after="60"/>
         <w:rPr>
-          <w:rFonts w:ascii="Segoe UI" w:hAnsi="Segoe UI" w:cs="Segoe UI"/>
-        </w:rPr>
-      </w:pPr>
-      <w:r>
-        <w:rPr>
-          <w:rFonts w:ascii="Segoe UI" w:eastAsia="Arial" w:hAnsi="Segoe UI" w:cs="Segoe UI"/>
-          <w:color w:val="1A1A1A"/>
-        </w:rPr>
-        <w:t xml:space="preserve">Pagar o </w:t>
-      </w:r>
-      <w:proofErr w:type="spellStart"/>
-      <w:r>
-        <w:rPr>
-          <w:rFonts w:ascii="Segoe UI" w:eastAsia="Arial" w:hAnsi="Segoe UI" w:cs="Segoe UI"/>
-          <w:color w:val="1A1A1A"/>
-        </w:rPr>
-        <w:t>fee</w:t>
-      </w:r>
-      <w:proofErr w:type="spellEnd"/>
-      <w:r>
-        <w:rPr>
-          <w:rFonts w:ascii="Segoe UI" w:eastAsia="Arial" w:hAnsi="Segoe UI" w:cs="Segoe UI"/>
-          <w:color w:val="1A1A1A"/>
-        </w:rPr>
-        <w:t xml:space="preserve"> de instalação na data de assinatura deste contrato.</w:t>
+          <w:rFonts w:asciiTheme="minorHAnsi" w:hAnsiTheme="minorHAnsi" w:cs="Segoe UI"/>
+        </w:rPr>
+      </w:pPr>
+      <w:r>
+        <w:rPr>
+          <w:rFonts w:asciiTheme="minorHAnsi" w:eastAsia="Arial" w:hAnsiTheme="minorHAnsi" w:cs="Segoe UI"/>
+          <w:color w:val="1A1A1A"/>
+        </w:rPr>
+        <w:t>Pagar os valores referentes ao pré-lançamento e as comissões de vendas no prazo estipulado, independente de quitação pelos compradores.</w:t>
       </w:r>
     </w:p>
     <w:p>
@@ -1467,15 +1314,15 @@
         </w:numPr>
         <w:spacing w:before="60" w:after="60"/>
         <w:rPr>
-          <w:rFonts w:ascii="Segoe UI" w:hAnsi="Segoe UI" w:cs="Segoe UI"/>
-        </w:rPr>
-      </w:pPr>
-      <w:r>
-        <w:rPr>
-          <w:rFonts w:ascii="Segoe UI" w:eastAsia="Arial" w:hAnsi="Segoe UI" w:cs="Segoe UI"/>
-          <w:color w:val="1A1A1A"/>
-        </w:rPr>
-        <w:t>Pagar as comissões no prazo estipulado, independente de quitação pelos compradores.</w:t>
+          <w:rFonts w:asciiTheme="minorHAnsi" w:hAnsiTheme="minorHAnsi" w:cs="Segoe UI"/>
+        </w:rPr>
+      </w:pPr>
+      <w:r>
+        <w:rPr>
+          <w:rFonts w:asciiTheme="minorHAnsi" w:eastAsia="Arial" w:hAnsiTheme="minorHAnsi" w:cs="Segoe UI"/>
+          <w:color w:val="1A1A1A"/>
+        </w:rPr>
+        <w:t>Responsabilizar-se pela emissão de boletos e gestão financeira dos compradores.</w:t>
       </w:r>
     </w:p>
     <w:p>
@@ -1487,15 +1334,15 @@
         </w:numPr>
         <w:spacing w:before="60" w:after="60"/>
         <w:rPr>
-          <w:rFonts w:ascii="Segoe UI" w:hAnsi="Segoe UI" w:cs="Segoe UI"/>
-        </w:rPr>
-      </w:pPr>
-      <w:r>
-        <w:rPr>
-          <w:rFonts w:ascii="Segoe UI" w:eastAsia="Arial" w:hAnsi="Segoe UI" w:cs="Segoe UI"/>
-          <w:color w:val="1A1A1A"/>
-        </w:rPr>
-        <w:t>Responsabilizar-se pela emissão de boletos e gestão financeira dos compradores.</w:t>
+          <w:rFonts w:asciiTheme="minorHAnsi" w:hAnsiTheme="minorHAnsi" w:cs="Segoe UI"/>
+        </w:rPr>
+      </w:pPr>
+      <w:r>
+        <w:rPr>
+          <w:rFonts w:asciiTheme="minorHAnsi" w:eastAsia="Arial" w:hAnsiTheme="minorHAnsi" w:cs="Segoe UI"/>
+          <w:color w:val="1A1A1A"/>
+        </w:rPr>
+        <w:t>Produzir e assinar contratos de venda com agilidade para evitar desistências.</w:t>
       </w:r>
     </w:p>
     <w:p>
@@ -1507,15 +1354,15 @@
         </w:numPr>
         <w:spacing w:before="60" w:after="60"/>
         <w:rPr>
-          <w:rFonts w:ascii="Segoe UI" w:hAnsi="Segoe UI" w:cs="Segoe UI"/>
-        </w:rPr>
-      </w:pPr>
-      <w:r>
-        <w:rPr>
-          <w:rFonts w:ascii="Segoe UI" w:eastAsia="Arial" w:hAnsi="Segoe UI" w:cs="Segoe UI"/>
-          <w:color w:val="1A1A1A"/>
-        </w:rPr>
-        <w:t>Assinar contratos de venda com agilidade para evitar desistências.</w:t>
+          <w:rFonts w:asciiTheme="minorHAnsi" w:hAnsiTheme="minorHAnsi" w:cs="Segoe UI"/>
+        </w:rPr>
+      </w:pPr>
+      <w:r>
+        <w:rPr>
+          <w:rFonts w:asciiTheme="minorHAnsi" w:eastAsia="Arial" w:hAnsiTheme="minorHAnsi" w:cs="Segoe UI"/>
+          <w:color w:val="1A1A1A"/>
+        </w:rPr>
+        <w:t>Arcar com despesas extras aprovadas no plano: eventos, mídia offline, tráfego pago, vídeos e renderizações.</w:t>
       </w:r>
     </w:p>
     <w:p>
@@ -1527,15 +1374,15 @@
         </w:numPr>
         <w:spacing w:before="60" w:after="60"/>
         <w:rPr>
-          <w:rFonts w:ascii="Segoe UI" w:hAnsi="Segoe UI" w:cs="Segoe UI"/>
-        </w:rPr>
-      </w:pPr>
-      <w:r>
-        <w:rPr>
-          <w:rFonts w:ascii="Segoe UI" w:eastAsia="Arial" w:hAnsi="Segoe UI" w:cs="Segoe UI"/>
-          <w:color w:val="1A1A1A"/>
-        </w:rPr>
-        <w:t>Arcar com despesas extras aprovadas no plano: eventos, mídia offline, tráfego pago, vídeos e renderizações.</w:t>
+          <w:rFonts w:asciiTheme="minorHAnsi" w:hAnsiTheme="minorHAnsi" w:cs="Segoe UI"/>
+        </w:rPr>
+      </w:pPr>
+      <w:r>
+        <w:rPr>
+          <w:rFonts w:asciiTheme="minorHAnsi" w:eastAsia="Arial" w:hAnsiTheme="minorHAnsi" w:cs="Segoe UI"/>
+          <w:color w:val="1A1A1A"/>
+        </w:rPr>
+        <w:t>Fornecer documentos, informações e autorizações em até 5 dias úteis após solicitação.</w:t>
       </w:r>
     </w:p>
     <w:p>
@@ -1547,15 +1394,123 @@
         </w:numPr>
         <w:spacing w:before="60" w:after="60"/>
         <w:rPr>
-          <w:rFonts w:ascii="Segoe UI" w:hAnsi="Segoe UI" w:cs="Segoe UI"/>
-        </w:rPr>
-      </w:pPr>
-      <w:r>
-        <w:rPr>
-          <w:rFonts w:ascii="Segoe UI" w:eastAsia="Arial" w:hAnsi="Segoe UI" w:cs="Segoe UI"/>
-          <w:color w:val="1A1A1A"/>
-        </w:rPr>
-        <w:t>Fornecer documentos, informações e autorizações em até 5 dias úteis após solicitação.</w:t>
+          <w:rFonts w:asciiTheme="minorHAnsi" w:hAnsiTheme="minorHAnsi" w:cs="Segoe UI"/>
+        </w:rPr>
+      </w:pPr>
+      <w:r>
+        <w:rPr>
+          <w:rFonts w:asciiTheme="minorHAnsi" w:eastAsia="Arial" w:hAnsiTheme="minorHAnsi" w:cs="Segoe UI"/>
+          <w:color w:val="1A1A1A"/>
+        </w:rPr>
+        <w:t>Não negociar diretamente com corretores indicados pela CONTRATADA fora do escopo deste contrato.</w:t>
+      </w:r>
+    </w:p>
+    <w:p>
+      <w:pPr>
+        <w:pBdr>
+          <w:bottom w:val="single" w:sz="3" w:space="2" w:color="2B4D6E"/>
+        </w:pBdr>
+        <w:spacing w:before="300" w:after="120"/>
+        <w:rPr>
+          <w:rFonts w:asciiTheme="minorHAnsi" w:hAnsiTheme="minorHAnsi" w:cs="Segoe UI"/>
+        </w:rPr>
+      </w:pPr>
+      <w:r>
+        <w:rPr>
+          <w:rFonts w:asciiTheme="minorHAnsi" w:eastAsia="Arial" w:hAnsiTheme="minorHAnsi" w:cs="Segoe UI"/>
+          <w:b/>
+          <w:bCs/>
+          <w:color w:val="2B4D6E"/>
+          <w:sz w:val="22"/>
+          <w:szCs w:val="22"/>
+        </w:rPr>
+        <w:t>CLÁUSULA SÉTIMA — DO PRAZO</w:t>
+      </w:r>
+    </w:p>
+    <w:p>
+      <w:pPr>
+        <w:spacing w:before="80" w:after="80"/>
+        <w:jc w:val="both"/>
+        <w:rPr>
+          <w:rFonts w:asciiTheme="minorHAnsi" w:hAnsiTheme="minorHAnsi" w:cs="Segoe UI"/>
+        </w:rPr>
+      </w:pPr>
+      <w:r>
+        <w:rPr>
+          <w:rFonts w:asciiTheme="minorHAnsi" w:eastAsia="Arial" w:hAnsiTheme="minorHAnsi" w:cs="Segoe UI"/>
+          <w:color w:val="1A1A1A"/>
+        </w:rPr>
+        <w:t xml:space="preserve">7.1 O prazo deste contrato é válido desde a data de assinatura até </w:t>
+      </w:r>
+      <w:r>
+        <w:rPr>
+          <w:rFonts w:asciiTheme="minorHAnsi" w:eastAsia="Arial" w:hAnsiTheme="minorHAnsi" w:cs="Segoe UI"/>
+          <w:b/>
+          <w:bCs/>
+          <w:color w:val="1A1A1A"/>
+        </w:rPr>
+        <w:t>3 (três) meses após a data de início das vendas</w:t>
+      </w:r>
+      <w:r>
+        <w:rPr>
+          <w:rFonts w:asciiTheme="minorHAnsi" w:eastAsia="Arial" w:hAnsiTheme="minorHAnsi" w:cs="Segoe UI"/>
+          <w:color w:val="1A1A1A"/>
+        </w:rPr>
+        <w:t>.</w:t>
+      </w:r>
+    </w:p>
+    <w:p>
+      <w:pPr>
+        <w:spacing w:before="80" w:after="80"/>
+        <w:jc w:val="both"/>
+        <w:rPr>
+          <w:rFonts w:asciiTheme="minorHAnsi" w:hAnsiTheme="minorHAnsi" w:cs="Segoe UI"/>
+        </w:rPr>
+      </w:pPr>
+      <w:r>
+        <w:rPr>
+          <w:rFonts w:asciiTheme="minorHAnsi" w:eastAsia="Arial" w:hAnsiTheme="minorHAnsi" w:cs="Segoe UI"/>
+          <w:color w:val="1A1A1A"/>
+        </w:rPr>
+        <w:t>§ 1º — Início dos trabalhos estratégicos: As atividades de diagnóstico, viabilidade e planejamento iniciam-se na data de assinatura. O pré-lançamento operacional inicia-se entre 90 dias antes da data prevista de lançamento, conforme cronograma acordado entre as partes.</w:t>
+      </w:r>
+    </w:p>
+    <w:p>
+      <w:pPr>
+        <w:pBdr>
+          <w:bottom w:val="single" w:sz="3" w:space="2" w:color="2B4D6E"/>
+        </w:pBdr>
+        <w:spacing w:before="300" w:after="120"/>
+        <w:rPr>
+          <w:rFonts w:asciiTheme="minorHAnsi" w:hAnsiTheme="minorHAnsi" w:cs="Segoe UI"/>
+        </w:rPr>
+      </w:pPr>
+      <w:r>
+        <w:rPr>
+          <w:rFonts w:asciiTheme="minorHAnsi" w:eastAsia="Arial" w:hAnsiTheme="minorHAnsi" w:cs="Segoe UI"/>
+          <w:b/>
+          <w:bCs/>
+          <w:color w:val="2B4D6E"/>
+          <w:sz w:val="22"/>
+          <w:szCs w:val="22"/>
+        </w:rPr>
+        <w:t>CLÁUSULA OITAVA — DA RESCISÃO E PENALIDADES</w:t>
+      </w:r>
+    </w:p>
+    <w:p>
+      <w:pPr>
+        <w:spacing w:before="80" w:after="80"/>
+        <w:jc w:val="both"/>
+        <w:rPr>
+          <w:rFonts w:asciiTheme="minorHAnsi" w:hAnsiTheme="minorHAnsi" w:cs="Segoe UI"/>
+        </w:rPr>
+      </w:pPr>
+      <w:r>
+        <w:rPr>
+          <w:rFonts w:asciiTheme="minorHAnsi" w:eastAsia="Arial" w:hAnsiTheme="minorHAnsi" w:cs="Segoe UI"/>
+          <w:color w:val="1A1A1A"/>
+        </w:rPr>
+        <w:t>8.1 Este contrato poderá ser rescindido:</w:t>
       </w:r>
     </w:p>
     <w:p>
@@ -1567,124 +1522,15 @@
         </w:numPr>
         <w:spacing w:before="60" w:after="60"/>
         <w:rPr>
-          <w:rFonts w:ascii="Segoe UI" w:hAnsi="Segoe UI" w:cs="Segoe UI"/>
-        </w:rPr>
-      </w:pPr>
-      <w:r>
-        <w:rPr>
-          <w:rFonts w:ascii="Segoe UI" w:eastAsia="Arial" w:hAnsi="Segoe UI" w:cs="Segoe UI"/>
-          <w:color w:val="1A1A1A"/>
-        </w:rPr>
-        <w:t>Não negociar diretamente com corretores indicados pela CONTRATADA fora do escopo deste contrato.</w:t>
-      </w:r>
-    </w:p>
-    <w:p>
-      <w:pPr>
-        <w:pBdr>
-          <w:bottom w:val="single" w:sz="3" w:space="2" w:color="2B4D6E"/>
-        </w:pBdr>
-        <w:spacing w:before="300" w:after="120"/>
-        <w:rPr>
-          <w:rFonts w:ascii="Segoe UI" w:hAnsi="Segoe UI" w:cs="Segoe UI"/>
-        </w:rPr>
-      </w:pPr>
-      <w:r>
-        <w:rPr>
-          <w:rFonts w:ascii="Segoe UI" w:eastAsia="Arial" w:hAnsi="Segoe UI" w:cs="Segoe UI"/>
-          <w:b/>
-          <w:bCs/>
-          <w:color w:val="2B4D6E"/>
-          <w:sz w:val="22"/>
-          <w:szCs w:val="22"/>
-        </w:rPr>
-        <w:t>CLÁUSULA SÉTIMA — DO PRAZO</w:t>
-      </w:r>
-    </w:p>
-    <w:p>
-      <w:pPr>
-        <w:spacing w:before="80" w:after="80"/>
-        <w:jc w:val="both"/>
-        <w:rPr>
-          <w:rFonts w:ascii="Segoe UI" w:hAnsi="Segoe UI" w:cs="Segoe UI"/>
-        </w:rPr>
-      </w:pPr>
-      <w:r>
-        <w:rPr>
-          <w:rFonts w:ascii="Segoe UI" w:eastAsia="Arial" w:hAnsi="Segoe UI" w:cs="Segoe UI"/>
-          <w:color w:val="1A1A1A"/>
-        </w:rPr>
-        <w:t xml:space="preserve">7.1 O prazo deste contrato é válido desde a data de assinatura até </w:t>
-      </w:r>
-      <w:r>
-        <w:rPr>
-          <w:rFonts w:ascii="Segoe UI" w:eastAsia="Arial" w:hAnsi="Segoe UI" w:cs="Segoe UI"/>
-          <w:b/>
-          <w:bCs/>
-          <w:color w:val="1A1A1A"/>
-        </w:rPr>
-        <w:t>3 (três) meses após a data de início das vendas</w:t>
-      </w:r>
-      <w:r>
-        <w:rPr>
-          <w:rFonts w:ascii="Segoe UI" w:eastAsia="Arial" w:hAnsi="Segoe UI" w:cs="Segoe UI"/>
-          <w:color w:val="1A1A1A"/>
-        </w:rPr>
-        <w:t>.</w:t>
-      </w:r>
-    </w:p>
-    <w:p>
-      <w:pPr>
-        <w:spacing w:before="80" w:after="80"/>
-        <w:jc w:val="both"/>
-        <w:rPr>
-          <w:rFonts w:ascii="Segoe UI" w:hAnsi="Segoe UI" w:cs="Segoe UI"/>
-        </w:rPr>
-      </w:pPr>
-      <w:r>
-        <w:rPr>
-          <w:rFonts w:ascii="Segoe UI" w:eastAsia="Arial" w:hAnsi="Segoe UI" w:cs="Segoe UI"/>
-          <w:color w:val="1A1A1A"/>
-        </w:rPr>
-        <w:t>§ 1º — Início dos trabalhos estratégicos: As atividades de diagnóstico, viabilidade e planejamento iniciam-se na data de assinatura. O pré-lançamento operacional inicia-se entre 30 e 90 dias antes da data prevista de lançamento, conforme cronograma acordado entre as partes.</w:t>
-      </w:r>
-    </w:p>
-    <w:p>
-      <w:pPr>
-        <w:pBdr>
-          <w:bottom w:val="single" w:sz="3" w:space="2" w:color="2B4D6E"/>
-        </w:pBdr>
-        <w:spacing w:before="300" w:after="120"/>
-        <w:rPr>
-          <w:rFonts w:ascii="Segoe UI" w:hAnsi="Segoe UI" w:cs="Segoe UI"/>
-        </w:rPr>
-      </w:pPr>
-      <w:r>
-        <w:rPr>
-          <w:rFonts w:ascii="Segoe UI" w:eastAsia="Arial" w:hAnsi="Segoe UI" w:cs="Segoe UI"/>
-          <w:b/>
-          <w:bCs/>
-          <w:color w:val="2B4D6E"/>
-          <w:sz w:val="22"/>
-          <w:szCs w:val="22"/>
-        </w:rPr>
-        <w:lastRenderedPageBreak/>
-        <w:t>CLÁUSULA OITAVA — DA RESCISÃO E PENALIDADES</w:t>
-      </w:r>
-    </w:p>
-    <w:p>
-      <w:pPr>
-        <w:spacing w:before="80" w:after="80"/>
-        <w:jc w:val="both"/>
-        <w:rPr>
-          <w:rFonts w:ascii="Segoe UI" w:hAnsi="Segoe UI" w:cs="Segoe UI"/>
-        </w:rPr>
-      </w:pPr>
-      <w:r>
-        <w:rPr>
-          <w:rFonts w:ascii="Segoe UI" w:eastAsia="Arial" w:hAnsi="Segoe UI" w:cs="Segoe UI"/>
-          <w:color w:val="1A1A1A"/>
-        </w:rPr>
-        <w:t>8.1 Este contrato poderá ser rescindido:</w:t>
+          <w:rFonts w:asciiTheme="minorHAnsi" w:hAnsiTheme="minorHAnsi" w:cs="Segoe UI"/>
+        </w:rPr>
+      </w:pPr>
+      <w:r>
+        <w:rPr>
+          <w:rFonts w:asciiTheme="minorHAnsi" w:eastAsia="Arial" w:hAnsiTheme="minorHAnsi" w:cs="Segoe UI"/>
+          <w:color w:val="1A1A1A"/>
+        </w:rPr>
+        <w:t>Por mútuo acordo entre as partes, sem ônus.</w:t>
       </w:r>
     </w:p>
     <w:p>
@@ -1696,15 +1542,15 @@
         </w:numPr>
         <w:spacing w:before="60" w:after="60"/>
         <w:rPr>
-          <w:rFonts w:ascii="Segoe UI" w:hAnsi="Segoe UI" w:cs="Segoe UI"/>
-        </w:rPr>
-      </w:pPr>
-      <w:r>
-        <w:rPr>
-          <w:rFonts w:ascii="Segoe UI" w:eastAsia="Arial" w:hAnsi="Segoe UI" w:cs="Segoe UI"/>
-          <w:color w:val="1A1A1A"/>
-        </w:rPr>
-        <w:t>Por mútuo acordo entre as partes, sem ônus.</w:t>
+          <w:rFonts w:asciiTheme="minorHAnsi" w:hAnsiTheme="minorHAnsi" w:cs="Segoe UI"/>
+        </w:rPr>
+      </w:pPr>
+      <w:r>
+        <w:rPr>
+          <w:rFonts w:asciiTheme="minorHAnsi" w:eastAsia="Arial" w:hAnsiTheme="minorHAnsi" w:cs="Segoe UI"/>
+          <w:color w:val="1A1A1A"/>
+        </w:rPr>
+        <w:t>Por descumprimento contratual, mediante notificação prévia por escrito com 30 (trinta) dias de antecedência.</w:t>
       </w:r>
     </w:p>
     <w:p>
@@ -1716,32 +1562,12 @@
         </w:numPr>
         <w:spacing w:before="60" w:after="60"/>
         <w:rPr>
-          <w:rFonts w:ascii="Segoe UI" w:hAnsi="Segoe UI" w:cs="Segoe UI"/>
-        </w:rPr>
-      </w:pPr>
-      <w:r>
-        <w:rPr>
-          <w:rFonts w:ascii="Segoe UI" w:eastAsia="Arial" w:hAnsi="Segoe UI" w:cs="Segoe UI"/>
-          <w:color w:val="1A1A1A"/>
-        </w:rPr>
-        <w:t>Por descumprimento contratual, mediante notificação prévia por escrito com 30 (trinta) dias de antecedência.</w:t>
-      </w:r>
-    </w:p>
-    <w:p>
-      <w:pPr>
-        <w:pStyle w:val="PargrafodaLista"/>
-        <w:numPr>
-          <w:ilvl w:val="0"/>
-          <w:numId w:val="2"/>
-        </w:numPr>
-        <w:spacing w:before="60" w:after="60"/>
-        <w:rPr>
-          <w:rFonts w:ascii="Segoe UI" w:hAnsi="Segoe UI" w:cs="Segoe UI"/>
-        </w:rPr>
-      </w:pPr>
-      <w:r>
-        <w:rPr>
-          <w:rFonts w:ascii="Segoe UI" w:eastAsia="Arial" w:hAnsi="Segoe UI" w:cs="Segoe UI"/>
+          <w:rFonts w:asciiTheme="minorHAnsi" w:hAnsiTheme="minorHAnsi" w:cs="Segoe UI"/>
+        </w:rPr>
+      </w:pPr>
+      <w:r>
+        <w:rPr>
+          <w:rFonts w:asciiTheme="minorHAnsi" w:eastAsia="Arial" w:hAnsiTheme="minorHAnsi" w:cs="Segoe UI"/>
           <w:color w:val="1A1A1A"/>
         </w:rPr>
         <w:t>Em caso de força maior ou fato superveniente que inviabilize a execução.</w:t>
@@ -1751,12 +1577,12 @@
       <w:pPr>
         <w:spacing w:before="200" w:after="80"/>
         <w:rPr>
-          <w:rFonts w:ascii="Segoe UI" w:hAnsi="Segoe UI" w:cs="Segoe UI"/>
-        </w:rPr>
-      </w:pPr>
-      <w:r>
-        <w:rPr>
-          <w:rFonts w:ascii="Segoe UI" w:eastAsia="Arial" w:hAnsi="Segoe UI" w:cs="Segoe UI"/>
+          <w:rFonts w:asciiTheme="minorHAnsi" w:hAnsiTheme="minorHAnsi" w:cs="Segoe UI"/>
+        </w:rPr>
+      </w:pPr>
+      <w:r>
+        <w:rPr>
+          <w:rFonts w:asciiTheme="minorHAnsi" w:eastAsia="Arial" w:hAnsiTheme="minorHAnsi" w:cs="Segoe UI"/>
           <w:b/>
           <w:bCs/>
           <w:color w:val="1A1A1A"/>
@@ -1769,28 +1595,28 @@
         <w:spacing w:before="80" w:after="80"/>
         <w:jc w:val="both"/>
         <w:rPr>
-          <w:rFonts w:ascii="Segoe UI" w:hAnsi="Segoe UI" w:cs="Segoe UI"/>
-        </w:rPr>
-      </w:pPr>
-      <w:r>
-        <w:rPr>
-          <w:rFonts w:ascii="Segoe UI" w:eastAsia="Arial" w:hAnsi="Segoe UI" w:cs="Segoe UI"/>
+          <w:rFonts w:asciiTheme="minorHAnsi" w:hAnsiTheme="minorHAnsi" w:cs="Segoe UI"/>
+        </w:rPr>
+      </w:pPr>
+      <w:r>
+        <w:rPr>
+          <w:rFonts w:asciiTheme="minorHAnsi" w:eastAsia="Arial" w:hAnsiTheme="minorHAnsi" w:cs="Segoe UI"/>
           <w:color w:val="1A1A1A"/>
         </w:rPr>
         <w:t xml:space="preserve">Em caso de rescisão unilateral pela CONTRATANTE antes do encerramento do prazo contratual, sem justo motivo, a CONTRATANTE pagará à CONTRATADA uma indenização equivalente a </w:t>
       </w:r>
       <w:r>
         <w:rPr>
-          <w:rFonts w:ascii="Segoe UI" w:eastAsia="Arial" w:hAnsi="Segoe UI" w:cs="Segoe UI"/>
+          <w:rFonts w:asciiTheme="minorHAnsi" w:eastAsia="Arial" w:hAnsiTheme="minorHAnsi" w:cs="Segoe UI"/>
           <w:b/>
           <w:bCs/>
           <w:color w:val="1A1A1A"/>
         </w:rPr>
-        <w:t>2% (dois por cento) do VGV total estimado do empreendimento</w:t>
-      </w:r>
-      <w:r>
-        <w:rPr>
-          <w:rFonts w:ascii="Segoe UI" w:eastAsia="Arial" w:hAnsi="Segoe UI" w:cs="Segoe UI"/>
+        <w:t>1% (um por cento) do VGV total estimado do empreendimento</w:t>
+      </w:r>
+      <w:r>
+        <w:rPr>
+          <w:rFonts w:asciiTheme="minorHAnsi" w:eastAsia="Arial" w:hAnsiTheme="minorHAnsi" w:cs="Segoe UI"/>
           <w:color w:val="1A1A1A"/>
         </w:rPr>
         <w:t>, como compensação pelo trabalho estratégico realizado e pela perda de receita projetada, sem prejuízo das comissões já devidas.</w:t>
@@ -1801,12 +1627,12 @@
         <w:spacing w:before="80" w:after="80"/>
         <w:jc w:val="both"/>
         <w:rPr>
-          <w:rFonts w:ascii="Segoe UI" w:hAnsi="Segoe UI" w:cs="Segoe UI"/>
-        </w:rPr>
-      </w:pPr>
-      <w:r>
-        <w:rPr>
-          <w:rFonts w:ascii="Segoe UI" w:eastAsia="Arial" w:hAnsi="Segoe UI" w:cs="Segoe UI"/>
+          <w:rFonts w:asciiTheme="minorHAnsi" w:hAnsiTheme="minorHAnsi" w:cs="Segoe UI"/>
+        </w:rPr>
+      </w:pPr>
+      <w:r>
+        <w:rPr>
+          <w:rFonts w:asciiTheme="minorHAnsi" w:eastAsia="Arial" w:hAnsiTheme="minorHAnsi" w:cs="Segoe UI"/>
           <w:i/>
           <w:iCs/>
           <w:color w:val="1A1A1A"/>
@@ -1821,18 +1647,19 @@
         </w:pBdr>
         <w:spacing w:before="300" w:after="120"/>
         <w:rPr>
-          <w:rFonts w:ascii="Segoe UI" w:hAnsi="Segoe UI" w:cs="Segoe UI"/>
-        </w:rPr>
-      </w:pPr>
-      <w:r>
-        <w:rPr>
-          <w:rFonts w:ascii="Segoe UI" w:eastAsia="Arial" w:hAnsi="Segoe UI" w:cs="Segoe UI"/>
+          <w:rFonts w:asciiTheme="minorHAnsi" w:hAnsiTheme="minorHAnsi" w:cs="Segoe UI"/>
+        </w:rPr>
+      </w:pPr>
+      <w:r>
+        <w:rPr>
+          <w:rFonts w:asciiTheme="minorHAnsi" w:eastAsia="Arial" w:hAnsiTheme="minorHAnsi" w:cs="Segoe UI"/>
           <w:b/>
           <w:bCs/>
           <w:color w:val="2B4D6E"/>
           <w:sz w:val="22"/>
           <w:szCs w:val="22"/>
         </w:rPr>
+        <w:lastRenderedPageBreak/>
         <w:t>CLÁUSULA NONA — DA PROPRIEDADE INTELECTUAL</w:t>
       </w:r>
     </w:p>
@@ -1841,33 +1668,15 @@
         <w:spacing w:before="80" w:after="80"/>
         <w:jc w:val="both"/>
         <w:rPr>
-          <w:rFonts w:ascii="Segoe UI" w:hAnsi="Segoe UI" w:cs="Segoe UI"/>
-        </w:rPr>
-      </w:pPr>
-      <w:r>
-        <w:rPr>
-          <w:rFonts w:ascii="Segoe UI" w:eastAsia="Arial" w:hAnsi="Segoe UI" w:cs="Segoe UI"/>
+          <w:rFonts w:asciiTheme="minorHAnsi" w:hAnsiTheme="minorHAnsi" w:cs="Segoe UI"/>
+        </w:rPr>
+      </w:pPr>
+      <w:r>
+        <w:rPr>
+          <w:rFonts w:asciiTheme="minorHAnsi" w:eastAsia="Arial" w:hAnsiTheme="minorHAnsi" w:cs="Segoe UI"/>
           <w:color w:val="1A1A1A"/>
         </w:rPr>
         <w:t>Todo material criado pela CONTRATADA no âmbito deste contrato — incluindo identidade visual, campanhas, estratégias e ferramentas — permanecerá como propriedade da CONTRATADA até a quitação integral das comissões devidas, quando será transferido à CONTRATANTE sem contrapartida financeira adicional.</w:t>
-      </w:r>
-    </w:p>
-    <w:p>
-      <w:pPr>
-        <w:spacing w:before="80" w:after="80"/>
-        <w:jc w:val="both"/>
-        <w:rPr>
-          <w:rFonts w:ascii="Segoe UI" w:hAnsi="Segoe UI" w:cs="Segoe UI"/>
-        </w:rPr>
-      </w:pPr>
-      <w:r>
-        <w:rPr>
-          <w:rFonts w:ascii="Segoe UI" w:eastAsia="Arial" w:hAnsi="Segoe UI" w:cs="Segoe UI"/>
-          <w:i/>
-          <w:iCs/>
-          <w:color w:val="1A1A1A"/>
-        </w:rPr>
-        <w:t>Parágrafo único: A base de leads, os processos comerciais e os métodos de gestão desenvolvidos pela CONTRATADA são de sua propriedade exclusiva e não se transferem à CONTRATANTE em nenhuma hipótese.</w:t>
       </w:r>
     </w:p>
     <w:p>
@@ -1877,12 +1686,12 @@
         </w:pBdr>
         <w:spacing w:before="300" w:after="120"/>
         <w:rPr>
-          <w:rFonts w:ascii="Segoe UI" w:hAnsi="Segoe UI" w:cs="Segoe UI"/>
-        </w:rPr>
-      </w:pPr>
-      <w:r>
-        <w:rPr>
-          <w:rFonts w:ascii="Segoe UI" w:eastAsia="Arial" w:hAnsi="Segoe UI" w:cs="Segoe UI"/>
+          <w:rFonts w:asciiTheme="minorHAnsi" w:hAnsiTheme="minorHAnsi" w:cs="Segoe UI"/>
+        </w:rPr>
+      </w:pPr>
+      <w:r>
+        <w:rPr>
+          <w:rFonts w:asciiTheme="minorHAnsi" w:eastAsia="Arial" w:hAnsiTheme="minorHAnsi" w:cs="Segoe UI"/>
           <w:b/>
           <w:bCs/>
           <w:color w:val="2B4D6E"/>
@@ -1897,12 +1706,12 @@
         <w:spacing w:before="80" w:after="80"/>
         <w:jc w:val="both"/>
         <w:rPr>
-          <w:rFonts w:ascii="Segoe UI" w:hAnsi="Segoe UI" w:cs="Segoe UI"/>
-        </w:rPr>
-      </w:pPr>
-      <w:r>
-        <w:rPr>
-          <w:rFonts w:ascii="Segoe UI" w:eastAsia="Arial" w:hAnsi="Segoe UI" w:cs="Segoe UI"/>
+          <w:rFonts w:asciiTheme="minorHAnsi" w:hAnsiTheme="minorHAnsi" w:cs="Segoe UI"/>
+        </w:rPr>
+      </w:pPr>
+      <w:r>
+        <w:rPr>
+          <w:rFonts w:asciiTheme="minorHAnsi" w:eastAsia="Arial" w:hAnsiTheme="minorHAnsi" w:cs="Segoe UI"/>
           <w:color w:val="1A1A1A"/>
         </w:rPr>
         <w:t>Ambas as partes se comprometem a manter sigilo absoluto sobre informações, estratégias e documentos obtidos em razão deste contrato, durante sua vigência e por prazo indeterminado após seu encerramento, salvo autorização expressa da parte contrária.</w:t>
@@ -1915,12 +1724,12 @@
         </w:pBdr>
         <w:spacing w:before="300" w:after="120"/>
         <w:rPr>
-          <w:rFonts w:ascii="Segoe UI" w:hAnsi="Segoe UI" w:cs="Segoe UI"/>
-        </w:rPr>
-      </w:pPr>
-      <w:r>
-        <w:rPr>
-          <w:rFonts w:ascii="Segoe UI" w:eastAsia="Arial" w:hAnsi="Segoe UI" w:cs="Segoe UI"/>
+          <w:rFonts w:asciiTheme="minorHAnsi" w:hAnsiTheme="minorHAnsi" w:cs="Segoe UI"/>
+        </w:rPr>
+      </w:pPr>
+      <w:r>
+        <w:rPr>
+          <w:rFonts w:asciiTheme="minorHAnsi" w:eastAsia="Arial" w:hAnsiTheme="minorHAnsi" w:cs="Segoe UI"/>
           <w:b/>
           <w:bCs/>
           <w:color w:val="2B4D6E"/>
@@ -1935,12 +1744,12 @@
         <w:spacing w:before="80" w:after="80"/>
         <w:jc w:val="both"/>
         <w:rPr>
-          <w:rFonts w:ascii="Segoe UI" w:hAnsi="Segoe UI" w:cs="Segoe UI"/>
-        </w:rPr>
-      </w:pPr>
-      <w:r>
-        <w:rPr>
-          <w:rFonts w:ascii="Segoe UI" w:eastAsia="Arial" w:hAnsi="Segoe UI" w:cs="Segoe UI"/>
+          <w:rFonts w:asciiTheme="minorHAnsi" w:hAnsiTheme="minorHAnsi" w:cs="Segoe UI"/>
+        </w:rPr>
+      </w:pPr>
+      <w:r>
+        <w:rPr>
+          <w:rFonts w:asciiTheme="minorHAnsi" w:eastAsia="Arial" w:hAnsiTheme="minorHAnsi" w:cs="Segoe UI"/>
           <w:color w:val="1A1A1A"/>
         </w:rPr>
         <w:t>A CONTRATANTE compromete-se a não contratar, direta ou indiretamente, qualquer colaborador ou prestador de serviço da CONTRATADA envolvido neste contrato, pelo prazo de 24 (vinte e quatro) meses após o término deste instrumento, sob pena de multa equivalente a 12 salários mensais do profissional aliciado.</w:t>
@@ -1953,12 +1762,12 @@
         </w:pBdr>
         <w:spacing w:before="300" w:after="120"/>
         <w:rPr>
-          <w:rFonts w:ascii="Segoe UI" w:hAnsi="Segoe UI" w:cs="Segoe UI"/>
-        </w:rPr>
-      </w:pPr>
-      <w:r>
-        <w:rPr>
-          <w:rFonts w:ascii="Segoe UI" w:eastAsia="Arial" w:hAnsi="Segoe UI" w:cs="Segoe UI"/>
+          <w:rFonts w:asciiTheme="minorHAnsi" w:hAnsiTheme="minorHAnsi" w:cs="Segoe UI"/>
+        </w:rPr>
+      </w:pPr>
+      <w:r>
+        <w:rPr>
+          <w:rFonts w:asciiTheme="minorHAnsi" w:eastAsia="Arial" w:hAnsiTheme="minorHAnsi" w:cs="Segoe UI"/>
           <w:b/>
           <w:bCs/>
           <w:color w:val="2B4D6E"/>
@@ -1973,23 +1782,15 @@
         <w:spacing w:before="80" w:after="80"/>
         <w:jc w:val="both"/>
         <w:rPr>
-          <w:rFonts w:ascii="Segoe UI" w:hAnsi="Segoe UI" w:cs="Segoe UI"/>
-        </w:rPr>
-      </w:pPr>
-      <w:r>
-        <w:rPr>
-          <w:rFonts w:ascii="Segoe UI" w:eastAsia="Arial" w:hAnsi="Segoe UI" w:cs="Segoe UI"/>
-          <w:color w:val="1A1A1A"/>
-        </w:rPr>
-        <w:t xml:space="preserve">Fica eleito o foro da comarca de {CIDADE_CLIENTE}/</w:t>
-      </w:r>
-      <w:proofErr w:type="gramEnd"/>
-      <w:r>
-        <w:rPr>
-          <w:rFonts w:ascii="Segoe UI" w:eastAsia="Arial" w:hAnsi="Segoe UI" w:cs="Segoe UI"/>
-          <w:color w:val="1A1A1A"/>
-        </w:rPr>
-        <w:t>SC, com renúncia a qualquer outro, para dirimir dúvidas oriundas deste contrato. As partes comprometem-se a buscar solução amigável antes de recorrer ao Judiciário.</w:t>
+          <w:rFonts w:asciiTheme="minorHAnsi" w:hAnsiTheme="minorHAnsi" w:cs="Segoe UI"/>
+        </w:rPr>
+      </w:pPr>
+      <w:r>
+        <w:rPr>
+          <w:rFonts w:asciiTheme="minorHAnsi" w:eastAsia="Arial" w:hAnsiTheme="minorHAnsi" w:cs="Segoe UI"/>
+          <w:color w:val="1A1A1A"/>
+        </w:rPr>
+        <w:t>Fica eleito o foro da comarca de Palhoça/SC, com renúncia a qualquer outro, para dirimir dúvidas oriundas deste contrato. As partes comprometem-se a buscar solução amigável antes de recorrer ao Judiciário.</w:t>
       </w:r>
     </w:p>
     <w:p>
@@ -1999,7 +1800,7 @@
         </w:pBdr>
         <w:spacing w:before="120" w:after="240"/>
         <w:rPr>
-          <w:rFonts w:ascii="Segoe UI" w:hAnsi="Segoe UI" w:cs="Segoe UI"/>
+          <w:rFonts w:asciiTheme="minorHAnsi" w:hAnsiTheme="minorHAnsi" w:cs="Segoe UI"/>
         </w:rPr>
       </w:pPr>
     </w:p>
@@ -2007,46 +1808,26 @@
       <w:pPr>
         <w:spacing w:before="200"/>
         <w:rPr>
-          <w:rFonts w:ascii="Segoe UI" w:hAnsi="Segoe UI" w:cs="Segoe UI"/>
+          <w:rFonts w:asciiTheme="minorHAnsi" w:hAnsiTheme="minorHAnsi" w:cs="Segoe UI"/>
         </w:rPr>
       </w:pPr>
     </w:p>
     <w:p>
       <w:pPr>
         <w:spacing w:after="240"/>
-        <w:jc w:val="center"/>
-        <w:rPr>
-          <w:rFonts w:ascii="Segoe UI" w:hAnsi="Segoe UI" w:cs="Segoe UI"/>
-        </w:rPr>
-      </w:pPr>
-      <w:r>
-        <w:rPr>
-          <w:rFonts w:ascii="Segoe UI" w:eastAsia="Arial" w:hAnsi="Segoe UI" w:cs="Segoe UI"/>
+        <w:jc w:val="right"/>
+        <w:rPr>
+          <w:rFonts w:asciiTheme="minorHAnsi" w:hAnsiTheme="minorHAnsi" w:cs="Segoe UI"/>
+        </w:rPr>
+      </w:pPr>
+      <w:r>
+        <w:rPr>
+          <w:rFonts w:asciiTheme="minorHAnsi" w:eastAsia="Arial" w:hAnsiTheme="minorHAnsi" w:cs="Segoe UI"/>
           <w:i/>
           <w:iCs/>
           <w:color w:val="555555"/>
         </w:rPr>
-        <w:t xml:space="preserve">{CIDADE_ASSINATURA}, _____ de ______________ </w:t>
-      </w:r>
-      <w:proofErr w:type="spellStart"/>
-      <w:r>
-        <w:rPr>
-          <w:rFonts w:ascii="Segoe UI" w:eastAsia="Arial" w:hAnsi="Segoe UI" w:cs="Segoe UI"/>
-          <w:i/>
-          <w:iCs/>
-          <w:color w:val="555555"/>
-        </w:rPr>
-        <w:t>de</w:t>
-      </w:r>
-      <w:proofErr w:type="spellEnd"/>
-      <w:r>
-        <w:rPr>
-          <w:rFonts w:ascii="Segoe UI" w:eastAsia="Arial" w:hAnsi="Segoe UI" w:cs="Segoe UI"/>
-          <w:i/>
-          <w:iCs/>
-          <w:color w:val="555555"/>
-        </w:rPr>
-        <w:t xml:space="preserve"> 2026.</w:t>
+        <w:t>{CIDADE_ASSINATURA}, _____ de ______________ de 2026.</w:t>
       </w:r>
     </w:p>
     <w:tbl>
@@ -2071,15 +1852,9 @@
         <w:gridCol w:w="4680"/>
       </w:tblGrid>
       <w:tr>
-        <w:tblPrEx>
-          <w:tblCellMar>
-            <w:top w:w="0" w:type="dxa"/>
-            <w:bottom w:w="0" w:type="dxa"/>
-          </w:tblCellMar>
-        </w:tblPrEx>
         <w:tc>
           <w:tcPr>
-            <w:tcW w:w="4500" w:type="dxa"/>
+            <w:tcW w:w="4680" w:type="dxa"/>
             <w:tcBorders>
               <w:top w:val="none" w:sz="0" w:space="0" w:color="FFFFFF"/>
               <w:left w:val="none" w:sz="0" w:space="0" w:color="FFFFFF"/>
@@ -2099,22 +1874,23 @@
                 <w:bottom w:val="single" w:sz="4" w:space="0" w:color="888888"/>
               </w:pBdr>
               <w:spacing w:before="600" w:after="80"/>
-              <w:rPr>
-                <w:rFonts w:ascii="Segoe UI" w:hAnsi="Segoe UI" w:cs="Segoe UI"/>
+              <w:jc w:val="center"/>
+              <w:rPr>
+                <w:rFonts w:asciiTheme="minorHAnsi" w:hAnsiTheme="minorHAnsi" w:cs="Segoe UI"/>
               </w:rPr>
             </w:pPr>
           </w:p>
           <w:p>
             <w:pPr>
               <w:spacing w:before="80" w:after="80"/>
-              <w:jc w:val="both"/>
-              <w:rPr>
-                <w:rFonts w:ascii="Segoe UI" w:hAnsi="Segoe UI" w:cs="Segoe UI"/>
+              <w:jc w:val="center"/>
+              <w:rPr>
+                <w:rFonts w:asciiTheme="minorHAnsi" w:hAnsiTheme="minorHAnsi" w:cs="Segoe UI"/>
               </w:rPr>
             </w:pPr>
             <w:r>
               <w:rPr>
-                <w:rFonts w:ascii="Segoe UI" w:eastAsia="Arial" w:hAnsi="Segoe UI" w:cs="Segoe UI"/>
+                <w:rFonts w:asciiTheme="minorHAnsi" w:eastAsia="Arial" w:hAnsiTheme="minorHAnsi" w:cs="Segoe UI"/>
                 <w:b/>
                 <w:bCs/>
                 <w:color w:val="1A1A1A"/>
@@ -2125,30 +1901,30 @@
           <w:p>
             <w:pPr>
               <w:spacing w:before="80" w:after="80"/>
-              <w:jc w:val="both"/>
-              <w:rPr>
-                <w:rFonts w:ascii="Segoe UI" w:hAnsi="Segoe UI" w:cs="Segoe UI"/>
+              <w:jc w:val="center"/>
+              <w:rPr>
+                <w:rFonts w:asciiTheme="minorHAnsi" w:hAnsiTheme="minorHAnsi" w:cs="Segoe UI"/>
               </w:rPr>
             </w:pPr>
             <w:r>
               <w:rPr>
-                <w:rFonts w:ascii="Segoe UI" w:eastAsia="Arial" w:hAnsi="Segoe UI" w:cs="Segoe UI"/>
+                <w:rFonts w:asciiTheme="minorHAnsi" w:eastAsia="Arial" w:hAnsiTheme="minorHAnsi" w:cs="Segoe UI"/>
                 <w:color w:val="1A1A1A"/>
               </w:rPr>
-              <w:t>Ramon Gracia Beza — CEO</w:t>
+              <w:t>Ramon Gracia Beza</w:t>
             </w:r>
           </w:p>
           <w:p>
             <w:pPr>
               <w:spacing w:before="80" w:after="80"/>
-              <w:jc w:val="both"/>
-              <w:rPr>
-                <w:rFonts w:ascii="Segoe UI" w:hAnsi="Segoe UI" w:cs="Segoe UI"/>
+              <w:jc w:val="center"/>
+              <w:rPr>
+                <w:rFonts w:asciiTheme="minorHAnsi" w:hAnsiTheme="minorHAnsi" w:cs="Segoe UI"/>
               </w:rPr>
             </w:pPr>
             <w:r>
               <w:rPr>
-                <w:rFonts w:ascii="Segoe UI" w:eastAsia="Arial" w:hAnsi="Segoe UI" w:cs="Segoe UI"/>
+                <w:rFonts w:asciiTheme="minorHAnsi" w:eastAsia="Arial" w:hAnsiTheme="minorHAnsi" w:cs="Segoe UI"/>
                 <w:color w:val="1A1A1A"/>
               </w:rPr>
               <w:t>CNPJ: 60.313.322/0001-12</w:t>
@@ -2157,7 +1933,7 @@
         </w:tc>
         <w:tc>
           <w:tcPr>
-            <w:tcW w:w="4500" w:type="dxa"/>
+            <w:tcW w:w="4680" w:type="dxa"/>
             <w:tcBorders>
               <w:top w:val="none" w:sz="0" w:space="0" w:color="FFFFFF"/>
               <w:left w:val="none" w:sz="0" w:space="0" w:color="FFFFFF"/>
@@ -2177,22 +1953,23 @@
                 <w:bottom w:val="single" w:sz="4" w:space="0" w:color="888888"/>
               </w:pBdr>
               <w:spacing w:before="600" w:after="80"/>
-              <w:rPr>
-                <w:rFonts w:ascii="Segoe UI" w:hAnsi="Segoe UI" w:cs="Segoe UI"/>
+              <w:jc w:val="center"/>
+              <w:rPr>
+                <w:rFonts w:asciiTheme="minorHAnsi" w:hAnsiTheme="minorHAnsi" w:cs="Segoe UI"/>
               </w:rPr>
             </w:pPr>
           </w:p>
           <w:p>
             <w:pPr>
               <w:spacing w:before="80" w:after="80"/>
-              <w:jc w:val="both"/>
-              <w:rPr>
-                <w:rFonts w:ascii="Segoe UI" w:hAnsi="Segoe UI" w:cs="Segoe UI"/>
+              <w:jc w:val="center"/>
+              <w:rPr>
+                <w:rFonts w:asciiTheme="minorHAnsi" w:hAnsiTheme="minorHAnsi" w:cs="Segoe UI"/>
               </w:rPr>
             </w:pPr>
             <w:r>
               <w:rPr>
-                <w:rFonts w:ascii="Segoe UI" w:eastAsia="Arial" w:hAnsi="Segoe UI" w:cs="Segoe UI"/>
+                <w:rFonts w:asciiTheme="minorHAnsi" w:eastAsia="Arial" w:hAnsiTheme="minorHAnsi" w:cs="Segoe UI"/>
                 <w:b/>
                 <w:bCs/>
                 <w:color w:val="1A1A1A"/>
@@ -2203,14 +1980,14 @@
           <w:p>
             <w:pPr>
               <w:spacing w:before="80" w:after="80"/>
-              <w:jc w:val="both"/>
-              <w:rPr>
-                <w:rFonts w:ascii="Segoe UI" w:hAnsi="Segoe UI" w:cs="Segoe UI"/>
+              <w:jc w:val="center"/>
+              <w:rPr>
+                <w:rFonts w:asciiTheme="minorHAnsi" w:hAnsiTheme="minorHAnsi" w:cs="Segoe UI"/>
               </w:rPr>
             </w:pPr>
             <w:r>
               <w:rPr>
-                <w:rFonts w:ascii="Segoe UI" w:eastAsia="Arial" w:hAnsi="Segoe UI" w:cs="Segoe UI"/>
+                <w:rFonts w:asciiTheme="minorHAnsi" w:eastAsia="Arial" w:hAnsiTheme="minorHAnsi" w:cs="Segoe UI"/>
                 <w:color w:val="1A1A1A"/>
               </w:rPr>
               <w:t>{NOME_REPRESENTANTE}</w:t>
@@ -2219,14 +1996,14 @@
           <w:p>
             <w:pPr>
               <w:spacing w:before="80" w:after="80"/>
-              <w:jc w:val="both"/>
-              <w:rPr>
-                <w:rFonts w:ascii="Segoe UI" w:hAnsi="Segoe UI" w:cs="Segoe UI"/>
+              <w:jc w:val="center"/>
+              <w:rPr>
+                <w:rFonts w:asciiTheme="minorHAnsi" w:hAnsiTheme="minorHAnsi" w:cs="Segoe UI"/>
               </w:rPr>
             </w:pPr>
             <w:r>
               <w:rPr>
-                <w:rFonts w:ascii="Segoe UI" w:eastAsia="Arial" w:hAnsi="Segoe UI" w:cs="Segoe UI"/>
+                <w:rFonts w:asciiTheme="minorHAnsi" w:eastAsia="Arial" w:hAnsiTheme="minorHAnsi" w:cs="Segoe UI"/>
                 <w:color w:val="1A1A1A"/>
               </w:rPr>
               <w:t>CNPJ: {CNPJ}</w:t>
@@ -2234,171 +2011,11 @@
           </w:p>
         </w:tc>
       </w:tr>
-      <w:tr>
-        <w:tblPrEx>
-          <w:tblCellMar>
-            <w:top w:w="0" w:type="dxa"/>
-            <w:bottom w:w="0" w:type="dxa"/>
-          </w:tblCellMar>
-        </w:tblPrEx>
-        <w:tc>
-          <w:tcPr>
-            <w:tcW w:w="4500" w:type="dxa"/>
-            <w:tcBorders>
-              <w:top w:val="none" w:sz="0" w:space="0" w:color="FFFFFF"/>
-              <w:left w:val="none" w:sz="0" w:space="0" w:color="FFFFFF"/>
-              <w:bottom w:val="none" w:sz="0" w:space="0" w:color="FFFFFF"/>
-              <w:right w:val="none" w:sz="0" w:space="0" w:color="FFFFFF"/>
-            </w:tcBorders>
-            <w:tcMar>
-              <w:top w:w="80" w:type="dxa"/>
-              <w:left w:w="80" w:type="dxa"/>
-              <w:bottom w:w="80" w:type="dxa"/>
-              <w:right w:w="80" w:type="dxa"/>
-            </w:tcMar>
-          </w:tcPr>
-          <w:p>
-            <w:pPr>
-              <w:pBdr>
-                <w:bottom w:val="single" w:sz="4" w:space="0" w:color="888888"/>
-              </w:pBdr>
-              <w:spacing w:before="600" w:after="80"/>
-              <w:rPr>
-                <w:rFonts w:ascii="Segoe UI" w:hAnsi="Segoe UI" w:cs="Segoe UI"/>
-              </w:rPr>
-            </w:pPr>
-          </w:p>
-          <w:p>
-            <w:pPr>
-              <w:spacing w:before="80" w:after="80"/>
-              <w:jc w:val="both"/>
-              <w:rPr>
-                <w:rFonts w:ascii="Segoe UI" w:hAnsi="Segoe UI" w:cs="Segoe UI"/>
-              </w:rPr>
-            </w:pPr>
-            <w:r>
-              <w:rPr>
-                <w:rFonts w:ascii="Segoe UI" w:eastAsia="Arial" w:hAnsi="Segoe UI" w:cs="Segoe UI"/>
-                <w:color w:val="1A1A1A"/>
-              </w:rPr>
-              <w:t>Testemunha 1</w:t>
-            </w:r>
-          </w:p>
-          <w:p>
-            <w:pPr>
-              <w:spacing w:before="80" w:after="80"/>
-              <w:jc w:val="both"/>
-              <w:rPr>
-                <w:rFonts w:ascii="Segoe UI" w:hAnsi="Segoe UI" w:cs="Segoe UI"/>
-              </w:rPr>
-            </w:pPr>
-            <w:r>
-              <w:rPr>
-                <w:rFonts w:ascii="Segoe UI" w:eastAsia="Arial" w:hAnsi="Segoe UI" w:cs="Segoe UI"/>
-                <w:color w:val="1A1A1A"/>
-              </w:rPr>
-              <w:t>Nome: ____________________________</w:t>
-            </w:r>
-          </w:p>
-          <w:p>
-            <w:pPr>
-              <w:spacing w:before="80" w:after="80"/>
-              <w:jc w:val="both"/>
-              <w:rPr>
-                <w:rFonts w:ascii="Segoe UI" w:hAnsi="Segoe UI" w:cs="Segoe UI"/>
-              </w:rPr>
-            </w:pPr>
-            <w:r>
-              <w:rPr>
-                <w:rFonts w:ascii="Segoe UI" w:eastAsia="Arial" w:hAnsi="Segoe UI" w:cs="Segoe UI"/>
-                <w:color w:val="1A1A1A"/>
-              </w:rPr>
-              <w:t>CPF:  ____________________________</w:t>
-            </w:r>
-          </w:p>
-        </w:tc>
-        <w:tc>
-          <w:tcPr>
-            <w:tcW w:w="4500" w:type="dxa"/>
-            <w:tcBorders>
-              <w:top w:val="none" w:sz="0" w:space="0" w:color="FFFFFF"/>
-              <w:left w:val="none" w:sz="0" w:space="0" w:color="FFFFFF"/>
-              <w:bottom w:val="none" w:sz="0" w:space="0" w:color="FFFFFF"/>
-              <w:right w:val="none" w:sz="0" w:space="0" w:color="FFFFFF"/>
-            </w:tcBorders>
-            <w:tcMar>
-              <w:top w:w="80" w:type="dxa"/>
-              <w:left w:w="80" w:type="dxa"/>
-              <w:bottom w:w="80" w:type="dxa"/>
-              <w:right w:w="80" w:type="dxa"/>
-            </w:tcMar>
-          </w:tcPr>
-          <w:p>
-            <w:pPr>
-              <w:pBdr>
-                <w:bottom w:val="single" w:sz="4" w:space="0" w:color="888888"/>
-              </w:pBdr>
-              <w:spacing w:before="600" w:after="80"/>
-              <w:rPr>
-                <w:rFonts w:ascii="Segoe UI" w:hAnsi="Segoe UI" w:cs="Segoe UI"/>
-              </w:rPr>
-            </w:pPr>
-          </w:p>
-          <w:p>
-            <w:pPr>
-              <w:spacing w:before="80" w:after="80"/>
-              <w:jc w:val="both"/>
-              <w:rPr>
-                <w:rFonts w:ascii="Segoe UI" w:hAnsi="Segoe UI" w:cs="Segoe UI"/>
-              </w:rPr>
-            </w:pPr>
-            <w:r>
-              <w:rPr>
-                <w:rFonts w:ascii="Segoe UI" w:eastAsia="Arial" w:hAnsi="Segoe UI" w:cs="Segoe UI"/>
-                <w:color w:val="1A1A1A"/>
-              </w:rPr>
-              <w:t>Testemunha 2</w:t>
-            </w:r>
-          </w:p>
-          <w:p>
-            <w:pPr>
-              <w:spacing w:before="80" w:after="80"/>
-              <w:jc w:val="both"/>
-              <w:rPr>
-                <w:rFonts w:ascii="Segoe UI" w:hAnsi="Segoe UI" w:cs="Segoe UI"/>
-              </w:rPr>
-            </w:pPr>
-            <w:r>
-              <w:rPr>
-                <w:rFonts w:ascii="Segoe UI" w:eastAsia="Arial" w:hAnsi="Segoe UI" w:cs="Segoe UI"/>
-                <w:color w:val="1A1A1A"/>
-              </w:rPr>
-              <w:t>Nome: ____________________________</w:t>
-            </w:r>
-          </w:p>
-          <w:p>
-            <w:pPr>
-              <w:spacing w:before="80" w:after="80"/>
-              <w:jc w:val="both"/>
-              <w:rPr>
-                <w:rFonts w:ascii="Segoe UI" w:hAnsi="Segoe UI" w:cs="Segoe UI"/>
-              </w:rPr>
-            </w:pPr>
-            <w:r>
-              <w:rPr>
-                <w:rFonts w:ascii="Segoe UI" w:eastAsia="Arial" w:hAnsi="Segoe UI" w:cs="Segoe UI"/>
-                <w:color w:val="1A1A1A"/>
-              </w:rPr>
-              <w:t>CPF:  ____________________________</w:t>
-            </w:r>
-          </w:p>
-        </w:tc>
-      </w:tr>
     </w:tbl>
     <w:p>
       <w:pPr>
         <w:rPr>
-          <w:rFonts w:ascii="Segoe UI" w:hAnsi="Segoe UI" w:cs="Segoe UI"/>
+          <w:rFonts w:asciiTheme="minorHAnsi" w:hAnsiTheme="minorHAnsi" w:cs="Segoe UI"/>
         </w:rPr>
       </w:pPr>
     </w:p>

</xml_diff>